<commit_message>
Inicial Francisco: retira renda de consultoria e referências ao Nubank e à genitora
Co-Authored-By: Claude Opus 5.5 <noreply@anthropic.com>
Claude-Session: https://claude.ai/code/session_01EVatDVNz5NJ1N9yNUnzyHx
</commit_message>
<xml_diff>
--- a/Francisco Bernardo Sousa Santos - Superendividamento/Inicial - Repactuação de dívidas - Francisco Bernardo Sousa Santos.docx
+++ b/Francisco Bernardo Sousa Santos - Superendividamento/Inicial - Repactuação de dívidas - Francisco Bernardo Sousa Santos.docx
@@ -407,19 +407,7 @@
       </w:r>
       <w:r>
         <w:rPr/>
-        <w:t xml:space="preserve">. Além dos dois vínculos, o Autor presta serviços de consultoria pedagógica, pelos quais tem recebido cerca de </w:t>
-      </w:r>
-      <w:r>
-        <w:rPr>
-          <w:rFonts w:ascii="Lora" w:cs="Lora" w:eastAsia="Lora" w:hAnsi="Lora"/>
-          <w:b/>
-          <w:bCs/>
-        </w:rPr>
-        <w:t xml:space="preserve">R$ 1.200,00</w:t>
-      </w:r>
-      <w:r>
-        <w:rPr/>
-        <w:t xml:space="preserve"> mensais. A remuneração líquida dos dois vínculos, sobre a qual incidem os consignados, é, portanto, de </w:t>
+        <w:t xml:space="preserve">. A remuneração líquida dos dois vínculos, sobre a qual incidem os consignados, é, portanto, de </w:t>
       </w:r>
       <w:r>
         <w:rPr>
@@ -1245,29 +1233,6 @@
       </w:pPr>
       <w:r>
         <w:rPr/>
-        <w:t xml:space="preserve">Diante da retenção, pelo Banco do Brasil, de todo crédito lançado em sua conta, o Autor passou a transferir parte dos valores recebidos à conta de sua genitora, Sra. Maria das Graças Souza, que os devolve gradualmente para a conta de titularidade do Autor no Nubank, por meio da qual são pagas despesas da casa, como as contas de energia e de água. Os extratos demonstram que, entre junho e outubro de 2026, retornaram ao Autor, por essa via, </w:t>
-      </w:r>
-      <w:r>
-        <w:rPr>
-          <w:rFonts w:ascii="Lora" w:cs="Lora" w:eastAsia="Lora" w:hAnsi="Lora"/>
-          <w:b/>
-          <w:bCs/>
-        </w:rPr>
-        <w:t xml:space="preserve">R$ 28.274,71</w:t>
-      </w:r>
-      <w:r>
-        <w:rPr/>
-        <w:t xml:space="preserve">, em dezenas de transferências de pequeno valor. Não se trata de ocultação de recursos, mas do meio encontrado pelo Autor para preservar o mínimo necessário à subsistência da família diante da captura de sua renda pelo banco, circunstância que desde já se esclarece em atenção ao dever de lealdade processual.</w:t>
-      </w:r>
-    </w:p>
-    <w:p>
-      <w:pPr>
-        <w:spacing w:after="60" w:line="360"/>
-        <w:ind w:firstLine="850"/>
-        <w:jc w:val="both"/>
-      </w:pPr>
-      <w:r>
-        <w:rPr/>
         <w:t xml:space="preserve">Desde então, a conta corrente do Autor encerra todos os dias com saldo zero, e os débitos de seguros, tributos e serviços são sucessivamente estornados. As despesas essenciais do Autor, que compõem concretamente o seu mínimo existencial, somam ao menos </w:t>
       </w:r>
       <w:r>
@@ -1415,19 +1380,19 @@
       </w:r>
       <w:r>
         <w:rPr/>
-        <w:t xml:space="preserve">; e a conta de internet de junho de 2026, serviço indispensável ao exercício da docência, só pôde ser paga em segunda via, acrescida de encargos. Somados o valor líquido creditado pelos dois municípios em setembro de 2026 (R$ 3.871,05) e a renda da consultoria (R$ 1.200,00), o Autor dispõe de cerca de </w:t>
-      </w:r>
-      <w:r>
-        <w:rPr>
-          <w:rFonts w:ascii="Lora" w:cs="Lora" w:eastAsia="Lora" w:hAnsi="Lora"/>
-          <w:b/>
-          <w:bCs/>
-        </w:rPr>
-        <w:t xml:space="preserve">R$ 5.071,05</w:t>
-      </w:r>
-      <w:r>
-        <w:rPr/>
-        <w:t xml:space="preserve"> por mês, valor praticamente idêntico ao de suas despesas essenciais e, ainda assim, sujeito aos débitos automáticos do Banco do Brasil.</w:t>
+        <w:t xml:space="preserve">; e a conta de internet de junho de 2026, serviço indispensável ao exercício da docência, só pôde ser paga em segunda via, acrescida de encargos. O valor líquido creditado pelos dois municípios em setembro de 2026 foi de </w:t>
+      </w:r>
+      <w:r>
+        <w:rPr>
+          <w:rFonts w:ascii="Lora" w:cs="Lora" w:eastAsia="Lora" w:hAnsi="Lora"/>
+          <w:b/>
+          <w:bCs/>
+        </w:rPr>
+        <w:t xml:space="preserve">R$ 3.871,05</w:t>
+      </w:r>
+      <w:r>
+        <w:rPr/>
+        <w:t xml:space="preserve">, inferior às despesas essenciais do Autor e, ainda assim, sujeito aos débitos automáticos do Banco do Brasil.</w:t>
       </w:r>
     </w:p>
     <w:p>
@@ -2180,35 +2145,21 @@
       </w:pPr>
       <w:r>
         <w:rPr/>
-        <w:t xml:space="preserve">8.	extratos da conta do Nubank de junho a outubro de 2026;</w:t>
-      </w:r>
-    </w:p>
-    <w:p>
-      <w:pPr>
-        <w:tabs>
-          <w:tab w:val="left" w:pos="1000"/>
-        </w:tabs>
-        <w:spacing w:after="60" w:line="360"/>
-        <w:ind w:left="1000" w:hanging="400"/>
-        <w:jc w:val="both"/>
-      </w:pPr>
-      <w:r>
-        <w:rPr/>
-        <w:t xml:space="preserve">9.	comprovantes de despesas essenciais (energia, água, internet e mensalidades escolares);</w:t>
-      </w:r>
-    </w:p>
-    <w:p>
-      <w:pPr>
-        <w:tabs>
-          <w:tab w:val="left" w:pos="1000"/>
-        </w:tabs>
-        <w:spacing w:after="60" w:line="360"/>
-        <w:ind w:left="1000" w:hanging="400"/>
-        <w:jc w:val="both"/>
-      </w:pPr>
-      <w:r>
-        <w:rPr/>
-        <w:t xml:space="preserve">10.	cópia do acórdão do Agravo de Instrumento nº 0757054-31.2025.8.18.0000 e da sentença do Processo nº 0800070-46.2025.8.18.0061.</w:t>
+        <w:t xml:space="preserve">8.	comprovantes de despesas essenciais (energia, água, internet e mensalidades escolares);</w:t>
+      </w:r>
+    </w:p>
+    <w:p>
+      <w:pPr>
+        <w:tabs>
+          <w:tab w:val="left" w:pos="1000"/>
+        </w:tabs>
+        <w:spacing w:after="60" w:line="360"/>
+        <w:ind w:left="1000" w:hanging="400"/>
+        <w:jc w:val="both"/>
+      </w:pPr>
+      <w:r>
+        <w:rPr/>
+        <w:t xml:space="preserve">9.	cópia do acórdão do Agravo de Instrumento nº 0757054-31.2025.8.18.0000 e da sentença do Processo nº 0800070-46.2025.8.18.0061.</w:t>
       </w:r>
     </w:p>
     <w:p>

</xml_diff>

<commit_message>
Francisco: rol de documentos numerado, procuração e declaração de hipossuficiência; pasta de protocolo fora do versionamento
Co-Authored-By: Claude Opus 5.5 <noreply@anthropic.com>
Claude-Session: https://claude.ai/code/session_01EVatDVNz5NJ1N9yNUnzyHx
</commit_message>
<xml_diff>
--- a/Francisco Bernardo Sousa Santos - Superendividamento/Inicial - Repactuação de dívidas - Francisco Bernardo Sousa Santos.docx
+++ b/Francisco Bernardo Sousa Santos - Superendividamento/Inicial - Repactuação de dívidas - Francisco Bernardo Sousa Santos.docx
@@ -2033,133 +2033,175 @@
       </w:pPr>
       <w:r>
         <w:rPr/>
-        <w:t xml:space="preserve">Instruem a inicial:</w:t>
-      </w:r>
-    </w:p>
-    <w:p>
-      <w:pPr>
-        <w:tabs>
-          <w:tab w:val="left" w:pos="1000"/>
-        </w:tabs>
-        <w:spacing w:after="60" w:line="360"/>
-        <w:ind w:left="1000" w:hanging="400"/>
-        <w:jc w:val="both"/>
-      </w:pPr>
-      <w:r>
-        <w:rPr/>
-        <w:t xml:space="preserve">1.	procuração, documento de identificação e comprovante de residência;</w:t>
-      </w:r>
-    </w:p>
-    <w:p>
-      <w:pPr>
-        <w:tabs>
-          <w:tab w:val="left" w:pos="1000"/>
-        </w:tabs>
-        <w:spacing w:after="60" w:line="360"/>
-        <w:ind w:left="1000" w:hanging="400"/>
-        <w:jc w:val="both"/>
-      </w:pPr>
-      <w:r>
-        <w:rPr/>
-        <w:t xml:space="preserve">2.	declaração de hipossuficiência;</w:t>
-      </w:r>
-    </w:p>
-    <w:p>
-      <w:pPr>
-        <w:tabs>
-          <w:tab w:val="left" w:pos="1000"/>
-        </w:tabs>
-        <w:spacing w:after="60" w:line="360"/>
-        <w:ind w:left="1000" w:hanging="400"/>
-        <w:jc w:val="both"/>
-      </w:pPr>
-      <w:r>
-        <w:rPr/>
-        <w:t xml:space="preserve">3.	contracheques do Município de Miguel Alves (março a setembro de 2026) e do Município de União (março a setembro de 2026);</w:t>
-      </w:r>
-    </w:p>
-    <w:p>
-      <w:pPr>
-        <w:tabs>
-          <w:tab w:val="left" w:pos="1000"/>
-        </w:tabs>
-        <w:spacing w:after="60" w:line="360"/>
-        <w:ind w:left="1000" w:hanging="400"/>
-        <w:jc w:val="both"/>
-      </w:pPr>
-      <w:r>
-        <w:rPr/>
-        <w:t xml:space="preserve">4.	Declaração de Margem Consignável emitida pela Secretaria Municipal de Educação de Miguel Alves em 07/10/2026;</w:t>
-      </w:r>
-    </w:p>
-    <w:p>
-      <w:pPr>
-        <w:tabs>
-          <w:tab w:val="left" w:pos="1000"/>
-        </w:tabs>
-        <w:spacing w:after="60" w:line="360"/>
-        <w:ind w:left="1000" w:hanging="400"/>
-        <w:jc w:val="both"/>
-      </w:pPr>
-      <w:r>
-        <w:rPr/>
-        <w:t xml:space="preserve">5.	telas do aplicativo do Banco do Brasil com os contratos ativos (“Meus empréstimos” e detalhes de cada operação);</w:t>
-      </w:r>
-    </w:p>
-    <w:p>
-      <w:pPr>
-        <w:tabs>
-          <w:tab w:val="left" w:pos="1000"/>
-        </w:tabs>
-        <w:spacing w:after="60" w:line="360"/>
-        <w:ind w:left="1000" w:hanging="400"/>
-        <w:jc w:val="both"/>
-      </w:pPr>
-      <w:r>
-        <w:rPr/>
-        <w:t xml:space="preserve">6.	extratos da conta corrente do Banco do Brasil (agência 2298-5, conta 6198-0) de março a setembro de 2026;</w:t>
-      </w:r>
-    </w:p>
-    <w:p>
-      <w:pPr>
-        <w:tabs>
-          <w:tab w:val="left" w:pos="1000"/>
-        </w:tabs>
-        <w:spacing w:after="60" w:line="360"/>
-        <w:ind w:left="1000" w:hanging="400"/>
-        <w:jc w:val="both"/>
-      </w:pPr>
-      <w:r>
-        <w:rPr/>
-        <w:t xml:space="preserve">7.	extratos da conta do Bradesco (agência 5792, conta 231325-1) e tela de “Operações Vencidas” de 14/10/2026;</w:t>
-      </w:r>
-    </w:p>
-    <w:p>
-      <w:pPr>
-        <w:tabs>
-          <w:tab w:val="left" w:pos="1000"/>
-        </w:tabs>
-        <w:spacing w:after="60" w:line="360"/>
-        <w:ind w:left="1000" w:hanging="400"/>
-        <w:jc w:val="both"/>
-      </w:pPr>
-      <w:r>
-        <w:rPr/>
-        <w:t xml:space="preserve">8.	comprovantes de despesas essenciais (energia, água, internet e mensalidades escolares);</w:t>
-      </w:r>
-    </w:p>
-    <w:p>
-      <w:pPr>
-        <w:tabs>
-          <w:tab w:val="left" w:pos="1000"/>
-        </w:tabs>
-        <w:spacing w:after="60" w:line="360"/>
-        <w:ind w:left="1000" w:hanging="400"/>
-        <w:jc w:val="both"/>
-      </w:pPr>
-      <w:r>
-        <w:rPr/>
-        <w:t xml:space="preserve">9.	cópia do acórdão do Agravo de Instrumento nº 0757054-31.2025.8.18.0000 e da sentença do Processo nº 0800070-46.2025.8.18.0061.</w:t>
+        <w:t xml:space="preserve">Instruem a inicial os seguintes documentos:</w:t>
+      </w:r>
+    </w:p>
+    <w:p>
+      <w:pPr>
+        <w:tabs>
+          <w:tab w:val="left" w:pos="1000"/>
+        </w:tabs>
+        <w:spacing w:after="60" w:line="360"/>
+        <w:ind w:left="1000" w:hanging="400"/>
+        <w:jc w:val="both"/>
+      </w:pPr>
+      <w:r>
+        <w:rPr/>
+        <w:t xml:space="preserve">Doc.	01. procuração;</w:t>
+      </w:r>
+    </w:p>
+    <w:p>
+      <w:pPr>
+        <w:tabs>
+          <w:tab w:val="left" w:pos="1000"/>
+        </w:tabs>
+        <w:spacing w:after="60" w:line="360"/>
+        <w:ind w:left="1000" w:hanging="400"/>
+        <w:jc w:val="both"/>
+      </w:pPr>
+      <w:r>
+        <w:rPr/>
+        <w:t xml:space="preserve">Doc.	02. documento de identificação do Autor;</w:t>
+      </w:r>
+    </w:p>
+    <w:p>
+      <w:pPr>
+        <w:tabs>
+          <w:tab w:val="left" w:pos="1000"/>
+        </w:tabs>
+        <w:spacing w:after="60" w:line="360"/>
+        <w:ind w:left="1000" w:hanging="400"/>
+        <w:jc w:val="both"/>
+      </w:pPr>
+      <w:r>
+        <w:rPr/>
+        <w:t xml:space="preserve">Doc.	03. comprovante de residência (fatura de internet em nome do Autor);</w:t>
+      </w:r>
+    </w:p>
+    <w:p>
+      <w:pPr>
+        <w:tabs>
+          <w:tab w:val="left" w:pos="1000"/>
+        </w:tabs>
+        <w:spacing w:after="60" w:line="360"/>
+        <w:ind w:left="1000" w:hanging="400"/>
+        <w:jc w:val="both"/>
+      </w:pPr>
+      <w:r>
+        <w:rPr/>
+        <w:t xml:space="preserve">Doc.	04. declaração de hipossuficiência;</w:t>
+      </w:r>
+    </w:p>
+    <w:p>
+      <w:pPr>
+        <w:tabs>
+          <w:tab w:val="left" w:pos="1000"/>
+        </w:tabs>
+        <w:spacing w:after="60" w:line="360"/>
+        <w:ind w:left="1000" w:hanging="400"/>
+        <w:jc w:val="both"/>
+      </w:pPr>
+      <w:r>
+        <w:rPr/>
+        <w:t xml:space="preserve">Doc.	05. contracheques do Município de Miguel Alves (março, abril, maio, julho, agosto e setembro de 2026);</w:t>
+      </w:r>
+    </w:p>
+    <w:p>
+      <w:pPr>
+        <w:tabs>
+          <w:tab w:val="left" w:pos="1000"/>
+        </w:tabs>
+        <w:spacing w:after="60" w:line="360"/>
+        <w:ind w:left="1000" w:hanging="400"/>
+        <w:jc w:val="both"/>
+      </w:pPr>
+      <w:r>
+        <w:rPr/>
+        <w:t xml:space="preserve">Doc.	06. contracheques do Município de União (março a setembro de 2026);</w:t>
+      </w:r>
+    </w:p>
+    <w:p>
+      <w:pPr>
+        <w:tabs>
+          <w:tab w:val="left" w:pos="1000"/>
+        </w:tabs>
+        <w:spacing w:after="60" w:line="360"/>
+        <w:ind w:left="1000" w:hanging="400"/>
+        <w:jc w:val="both"/>
+      </w:pPr>
+      <w:r>
+        <w:rPr/>
+        <w:t xml:space="preserve">Doc.	07. Declaração de Margem Consignável emitida pela Secretaria Municipal de Educação de Miguel Alves em 07/10/2026;</w:t>
+      </w:r>
+    </w:p>
+    <w:p>
+      <w:pPr>
+        <w:tabs>
+          <w:tab w:val="left" w:pos="1000"/>
+        </w:tabs>
+        <w:spacing w:after="60" w:line="360"/>
+        <w:ind w:left="1000" w:hanging="400"/>
+        <w:jc w:val="both"/>
+      </w:pPr>
+      <w:r>
+        <w:rPr/>
+        <w:t xml:space="preserve">Doc.	08. telas do aplicativo do Banco do Brasil com os contratos ativos (“Meus empréstimos” e detalhes de cada operação);</w:t>
+      </w:r>
+    </w:p>
+    <w:p>
+      <w:pPr>
+        <w:tabs>
+          <w:tab w:val="left" w:pos="1000"/>
+        </w:tabs>
+        <w:spacing w:after="60" w:line="360"/>
+        <w:ind w:left="1000" w:hanging="400"/>
+        <w:jc w:val="both"/>
+      </w:pPr>
+      <w:r>
+        <w:rPr/>
+        <w:t xml:space="preserve">Doc.	09. extratos da conta corrente do Banco do Brasil (agência 2298-5, conta 6198-0) de março a setembro de 2026, incluindo os lançamentos futuros de junho e agosto de 2026;</w:t>
+      </w:r>
+    </w:p>
+    <w:p>
+      <w:pPr>
+        <w:tabs>
+          <w:tab w:val="left" w:pos="1000"/>
+        </w:tabs>
+        <w:spacing w:after="60" w:line="360"/>
+        <w:ind w:left="1000" w:hanging="400"/>
+        <w:jc w:val="both"/>
+      </w:pPr>
+      <w:r>
+        <w:rPr/>
+        <w:t xml:space="preserve">Doc.	10. extratos da conta do Bradesco (agência 5792, conta 231325-1) e tela de “Operações Vencidas” de 14/10/2026;</w:t>
+      </w:r>
+    </w:p>
+    <w:p>
+      <w:pPr>
+        <w:tabs>
+          <w:tab w:val="left" w:pos="1000"/>
+        </w:tabs>
+        <w:spacing w:after="60" w:line="360"/>
+        <w:ind w:left="1000" w:hanging="400"/>
+        <w:jc w:val="both"/>
+      </w:pPr>
+      <w:r>
+        <w:rPr/>
+        <w:t xml:space="preserve">Doc.	11. comprovantes de despesas essenciais (energia, água e mensalidades escolares);</w:t>
+      </w:r>
+    </w:p>
+    <w:p>
+      <w:pPr>
+        <w:tabs>
+          <w:tab w:val="left" w:pos="1000"/>
+        </w:tabs>
+        <w:spacing w:after="60" w:line="360"/>
+        <w:ind w:left="1000" w:hanging="400"/>
+        <w:jc w:val="both"/>
+      </w:pPr>
+      <w:r>
+        <w:rPr/>
+        <w:t xml:space="preserve">Doc.	12. cópia do acórdão do Agravo de Instrumento nº 0757054-31.2025.8.18.0000 e da sentença do Processo nº 0800070-46.2025.8.18.0061.</w:t>
       </w:r>
     </w:p>
     <w:p>

</xml_diff>

<commit_message>
Inicial Francisco: nova redação da tutela (Tema 1.085), do plano de pagamento e da renda disponível
Co-Authored-By: Claude Opus 5.5 <noreply@anthropic.com>
Claude-Session: https://claude.ai/code/session_01EVatDVNz5NJ1N9yNUnzyHx
</commit_message>
<xml_diff>
--- a/Francisco Bernardo Sousa Santos - Superendividamento/Inicial - Repactuação de dívidas - Francisco Bernardo Sousa Santos.docx
+++ b/Francisco Bernardo Sousa Santos - Superendividamento/Inicial - Repactuação de dívidas - Francisco Bernardo Sousa Santos.docx
@@ -1380,7 +1380,41 @@
       </w:r>
       <w:r>
         <w:rPr/>
-        <w:t xml:space="preserve">; e a conta de internet de junho de 2026, serviço indispensável ao exercício da docência, só pôde ser paga em segunda via, acrescida de encargos. O valor líquido creditado pelos dois municípios em setembro de 2026 foi de </w:t>
+        <w:t xml:space="preserve">; e a conta de internet de junho de 2026, serviço indispensável ao exercício da docência, só pôde ser paga em segunda via, acrescida de encargos.</w:t>
+      </w:r>
+    </w:p>
+    <w:p>
+      <w:pPr>
+        <w:spacing w:after="60" w:line="360"/>
+        <w:ind w:firstLine="850"/>
+        <w:jc w:val="both"/>
+      </w:pPr>
+      <w:r>
+        <w:rPr/>
+        <w:t xml:space="preserve">Os contracheques dos dois vínculos indicam remuneração líquida mensal conjunta de </w:t>
+      </w:r>
+      <w:r>
+        <w:rPr>
+          <w:rFonts w:ascii="Lora" w:cs="Lora" w:eastAsia="Lora" w:hAnsi="Lora"/>
+          <w:b/>
+          <w:bCs/>
+        </w:rPr>
+        <w:t xml:space="preserve">R$ 14.203,80</w:t>
+      </w:r>
+      <w:r>
+        <w:rPr/>
+        <w:t xml:space="preserve">, deduzidos apenas a previdência e o imposto de renda, antes da incidência da pensão alimentícia, dos empréstimos consignados e dos demais débitos bancários.</w:t>
+      </w:r>
+    </w:p>
+    <w:p>
+      <w:pPr>
+        <w:spacing w:after="60" w:line="360"/>
+        <w:ind w:firstLine="850"/>
+        <w:jc w:val="both"/>
+      </w:pPr>
+      <w:r>
+        <w:rPr/>
+        <w:t xml:space="preserve">No mês de setembro de 2026, contudo, o valor líquido pago ao Autor pelos dois municípios foi de </w:t>
       </w:r>
       <w:r>
         <w:rPr>
@@ -1392,7 +1426,30 @@
       </w:r>
       <w:r>
         <w:rPr/>
-        <w:t xml:space="preserve">, inferior às despesas essenciais do Autor e, ainda assim, sujeito aos débitos automáticos do Banco do Brasil.</w:t>
+        <w:t xml:space="preserve"> (R$ 2.823,65 em Miguel Alves e R$ 1.047,40 em União), conforme os contracheques juntados. Esse valor não se confunde com a remuneração líquida nominal dos dois vínculos, pois corresponde ao montante que restou após os descontos em folha (previdência, imposto de renda, pensão alimentícia, empréstimos consignados e contribuição sindical) e, ainda assim, fica sujeito aos débitos automáticos lançados em conta corrente pelo Banco do Brasil.</w:t>
+      </w:r>
+    </w:p>
+    <w:p>
+      <w:pPr>
+        <w:spacing w:after="60" w:line="360"/>
+        <w:ind w:firstLine="850"/>
+        <w:jc w:val="both"/>
+      </w:pPr>
+      <w:r>
+        <w:rPr/>
+        <w:t xml:space="preserve">A diferença entre a remuneração líquida nominal e o valor efetivamente pago evidencia o comprometimento concreto da renda do Autor. Além disso, as despesas essenciais mensais foram estimadas em </w:t>
+      </w:r>
+      <w:r>
+        <w:rPr>
+          <w:rFonts w:ascii="Lora" w:cs="Lora" w:eastAsia="Lora" w:hAnsi="Lora"/>
+          <w:b/>
+          <w:bCs/>
+        </w:rPr>
+        <w:t xml:space="preserve">R$ 4.998,04</w:t>
+      </w:r>
+      <w:r>
+        <w:rPr/>
+        <w:t xml:space="preserve">, valor superior ao montante efetivamente pago em setembro de 2026.</w:t>
       </w:r>
     </w:p>
     <w:p>
@@ -1498,7 +1555,7 @@
       </w:pPr>
       <w:r>
         <w:rPr/>
-        <w:t xml:space="preserve">É exatamente o caso dos autos: as dívidas de consumo exigíveis consomem praticamente toda a renda líquida do Autor, que vive com a conta zerada e depende de novos créditos para pagar os anteriores.</w:t>
+        <w:t xml:space="preserve">É exatamente o caso dos autos, as dívidas de consumo exigíveis consomem praticamente toda a renda líquida do Autor, que vive com a conta zerada e depende de novos créditos para pagar os anteriores.</w:t>
       </w:r>
     </w:p>
     <w:p>
@@ -1653,18 +1710,18 @@
           <w:i/>
           <w:iCs/>
         </w:rPr>
-        <w:t xml:space="preserve">e.	Da inaplicabilidade do Tema 1.085 do STJ:</w:t>
-      </w:r>
-    </w:p>
-    <w:p>
-      <w:pPr>
-        <w:spacing w:after="60" w:line="360"/>
-        <w:ind w:firstLine="850"/>
-        <w:jc w:val="both"/>
-      </w:pPr>
-      <w:r>
-        <w:rPr/>
-        <w:t xml:space="preserve">Não se aplica ao caso o Tema 1.085 do STJ (REsp 1.863.973/SP). Não se pretende a aplicação analógica do limite de consignação a descontos em conta corrente de forma isolada, mas a repactuação global das dívidas de consumidor superendividado, com fundamento na Lei nº 14.181/2021. Quanto aos consignados em folha, o excesso decorre da própria superação da margem informada pelos órgãos pagadores.</w:t>
+        <w:t xml:space="preserve">e.	Do Tema 1.085 do STJ:</w:t>
+      </w:r>
+    </w:p>
+    <w:p>
+      <w:pPr>
+        <w:spacing w:after="60" w:line="360"/>
+        <w:ind w:firstLine="850"/>
+        <w:jc w:val="both"/>
+      </w:pPr>
+      <w:r>
+        <w:rPr/>
+        <w:t xml:space="preserve">O Tema 1.085 do STJ (REsp 1.863.973/SP) não obsta a pretensão. Não se pretende a aplicação analógica do limite de consignação a descontos em conta corrente de forma isolada, mas a repactuação global das dívidas de consumidor superendividado, com fundamento na Lei nº 14.181/2021. Quanto aos consignados em folha, o excesso decorre da própria superação da margem informada pelos órgãos pagadores.</w:t>
       </w:r>
     </w:p>
     <w:p>
@@ -1697,18 +1754,135 @@
       </w:pPr>
       <w:r>
         <w:rPr/>
-        <w:t xml:space="preserve">A probabilidade do direito está demonstrada pelos contracheques, que revelam consignados correspondentes a 51,45% da remuneração líquida, acima da margem informada pelos próprios órgãos pagadores, pela declaração da Secretaria Municipal de Educação de Miguel Alves que atesta margem de apenas R$ 1,26, e pelos extratos, que comprovam a conta zerada e a concessão automática de novos empréstimos para pagar os anteriores. O perigo de dano decorre da natureza alimentar do salário (art. 7º, X, da CF; art. 833, IV, do CPC): a cada mês, a renda do Autor é absorvida pelas dívidas, e a espera pela audiência agravará o débito, seja pelos novos “empréstimos” automáticos do Banco do Brasil, seja pelos encargos de mora do Bradesco, que elevaram o saldo vencido em quase R$ 20 mil em menos de quatro meses.</w:t>
-      </w:r>
-    </w:p>
-    <w:p>
-      <w:pPr>
-        <w:spacing w:after="60" w:line="360"/>
-        <w:ind w:firstLine="850"/>
-        <w:jc w:val="both"/>
-      </w:pPr>
-      <w:r>
-        <w:rPr/>
-        <w:t xml:space="preserve">A medida é reversível (art. 300, § 3º, do CPC). O Autor não se nega a pagar e declara, desde já, que se absterá de contrair novas dívidas e de praticar condutas que agravem sua situação de superendividamento (art. 104-A, § 4º, IV, do CDC).</w:t>
+        <w:t xml:space="preserve">A tutela de urgência deve ser apreciada à luz do art. 300 do CPC, que exige a presença concomitante da probabilidade do direito e do perigo de dano ou risco ao resultado útil do processo.</w:t>
+      </w:r>
+    </w:p>
+    <w:p>
+      <w:pPr>
+        <w:spacing w:after="60" w:line="360"/>
+        <w:ind w:firstLine="850"/>
+        <w:jc w:val="both"/>
+      </w:pPr>
+      <w:r>
+        <w:rPr/>
+        <w:t xml:space="preserve">No caso, a probabilidade do direito decorre dos contracheques, da declaração de margem consignável e dos extratos bancários, que demonstram comprometimento expressivo da renda do Autor, inclusive com lançamentos destinados à contratação automática de novos créditos para cobertura de parcelas anteriores.</w:t>
+      </w:r>
+    </w:p>
+    <w:p>
+      <w:pPr>
+        <w:spacing w:after="60" w:line="360"/>
+        <w:ind w:firstLine="850"/>
+        <w:jc w:val="both"/>
+      </w:pPr>
+      <w:r>
+        <w:rPr/>
+        <w:t xml:space="preserve">Quanto aos descontos realizados diretamente em folha de pagamento, requer-se a limitação provisória ao percentual de </w:t>
+      </w:r>
+      <w:r>
+        <w:rPr>
+          <w:rFonts w:ascii="Lora" w:cs="Lora" w:eastAsia="Lora" w:hAnsi="Lora"/>
+          <w:b/>
+          <w:bCs/>
+        </w:rPr>
+        <w:t xml:space="preserve">35% da remuneração líquida de cada vínculo</w:t>
+      </w:r>
+      <w:r>
+        <w:rPr/>
+        <w:t xml:space="preserve">, observadas as margens consignáveis informadas pelos próprios órgãos pagadores.</w:t>
+      </w:r>
+    </w:p>
+    <w:p>
+      <w:pPr>
+        <w:spacing w:after="60" w:line="360"/>
+        <w:ind w:firstLine="850"/>
+        <w:jc w:val="both"/>
+      </w:pPr>
+      <w:r>
+        <w:rPr/>
+        <w:t xml:space="preserve">A pretensão relativa aos débitos em conta corrente não se funda na aplicação analógica do limite legal dos empréstimos consignados. O Tema 1.085 do STJ afasta essa aplicação analógica aos empréstimos bancários comuns autorizados em conta corrente. No REsp 1.863.973/SP, julgado pela Segunda Seção do STJ em 09/03/2022 e publicado em 15/03/2022, foi fixada tese repetitiva nesse sentido:</w:t>
+      </w:r>
+    </w:p>
+    <w:p>
+      <w:pPr>
+        <w:pBdr>
+          <w:top w:val="single" w:color="9AA0A6" w:sz="4" w:space="6"/>
+          <w:bottom w:val="single" w:color="9AA0A6" w:sz="4" w:space="6"/>
+        </w:pBdr>
+        <w:spacing w:after="200" w:before="160" w:line="240"/>
+        <w:ind w:left="2270" w:right="570"/>
+        <w:jc w:val="both"/>
+      </w:pPr>
+      <w:r>
+        <w:rPr>
+          <w:sz w:val="18"/>
+          <w:szCs w:val="18"/>
+        </w:rPr>
+        <w:t xml:space="preserve">“RECURSO ESPECIAL REPRESENTATIVO DA CONTROVÉRSIA. PRETENSÃO DE LIMITAÇÃO DOS DESCONTOS DAS PARCELAS DE EMPRÉSTIMO COMUM EM CONTA-CORRENTE, EM APLICAÇÃO ANALÓGICA DA LEI N. 10.820/2003 QUE DISCIPLINA OS EMPRÉSTIMOS CONSIGNADOS EM FOLHA DE PAGAMENTO. IMPOSSIBILIDADE. RATIFICAÇÃO DA JURISPRUDÊNCIA DO SUPERIOR TRIBUNAL DE JUSTIÇA, COM FIXAÇÃO DE TESE REPETITIVA. RECURSO ESPECIAL PROVIDO. PREJUDICADO O RECURSO ESPECIAL DA DEMANDANTE, QUE PLEITEAVA A MAJORAÇÃO DA VERBA HONORÁRIA. </w:t>
+      </w:r>
+      <w:r>
+        <w:rPr>
+          <w:sz w:val="18"/>
+          <w:szCs w:val="18"/>
+          <w:highlight w:val="yellow"/>
+        </w:rPr>
+        <w:t xml:space="preserve">[...]</w:t>
+      </w:r>
+      <w:r>
+        <w:rPr>
+          <w:sz w:val="18"/>
+          <w:szCs w:val="18"/>
+        </w:rPr>
+        <w:t xml:space="preserve"> 8. Tese Repetitiva: </w:t>
+      </w:r>
+      <w:r>
+        <w:rPr>
+          <w:sz w:val="18"/>
+          <w:szCs w:val="18"/>
+          <w:rFonts w:ascii="Lora" w:cs="Lora" w:eastAsia="Lora" w:hAnsi="Lora"/>
+          <w:b/>
+          <w:bCs/>
+        </w:rPr>
+        <w:t xml:space="preserve">São lícitos os descontos de parcelas de empréstimos bancários comuns em conta-corrente, ainda que utilizada para recebimento de salários, desde que previamente autorizados pelo mutuário e enquanto esta autorização perdurar, não sendo aplicável, por analogia, a limitação prevista no § 1º do art. 1º da Lei n. 10.820/2003</w:t>
+      </w:r>
+      <w:r>
+        <w:rPr>
+          <w:sz w:val="18"/>
+          <w:szCs w:val="18"/>
+        </w:rPr>
+        <w:t xml:space="preserve">, que disciplina os empréstimos consignados em folha de pagamento. 9. Recurso especial da instituição financeira provido; e prejudicado o recurso especial da demandante.” (STJ – REsp 1.863.973/SP, Rel. Ministro Marco Aurélio Bellizze, Segunda Seção, j. 09/03/2022, DJe 15/03/2022)</w:t>
+      </w:r>
+    </w:p>
+    <w:p>
+      <w:pPr>
+        <w:spacing w:after="60" w:line="360"/>
+        <w:ind w:firstLine="850"/>
+        <w:jc w:val="both"/>
+      </w:pPr>
+      <w:r>
+        <w:rPr/>
+        <w:t xml:space="preserve">O pedido, nesse ponto, decorre da situação concreta de superendividamento e busca apenas impedir que os débitos automáticos consumam integralmente os recursos necessários à subsistência do Autor até a realização da audiência prevista no art. 104-A do CDC.</w:t>
+      </w:r>
+    </w:p>
+    <w:p>
+      <w:pPr>
+        <w:spacing w:after="60" w:line="360"/>
+        <w:ind w:firstLine="850"/>
+        <w:jc w:val="both"/>
+      </w:pPr>
+      <w:r>
+        <w:rPr/>
+        <w:t xml:space="preserve">Assim, requer-se que o Banco do Brasil se abstenha provisoriamente de realizar débitos automáticos que inviabilizem a manutenção das despesas essenciais do Autor, sem prejuízo da posterior apuração dos valores devidos e da apresentação do plano de pagamento na audiência de conciliação.</w:t>
+      </w:r>
+    </w:p>
+    <w:p>
+      <w:pPr>
+        <w:spacing w:after="60" w:line="360"/>
+        <w:ind w:firstLine="850"/>
+        <w:jc w:val="both"/>
+      </w:pPr>
+      <w:r>
+        <w:rPr/>
+        <w:t xml:space="preserve">O perigo de dano está demonstrado pela natureza alimentar dos rendimentos, pela existência de despesas essenciais em atraso e pelo risco de agravamento contínuo do saldo devedor mediante novos encargos e operações automáticas. A medida é reversível, pois os valores poderão ser considerados no plano consensual ou judicial posteriormente apresentado. O Autor declara, desde já, que se absterá de contrair novas dívidas e de praticar condutas que agravem sua situação de superendividamento (art. 104-A, § 4º, IV, do CDC).</w:t>
       </w:r>
     </w:p>
     <w:p>
@@ -1741,7 +1915,7 @@
       </w:pPr>
       <w:r>
         <w:rPr/>
-        <w:t xml:space="preserve">Em atenção ao art. 104-A do CDC, o Autor propõe o pagamento mensal de </w:t>
+        <w:t xml:space="preserve">O Autor apresenta, para fins de audiência conciliatória, proposta inicial de pagamento mensal de </w:t>
       </w:r>
       <w:r>
         <w:rPr>
@@ -1753,41 +1927,86 @@
       </w:r>
       <w:r>
         <w:rPr/>
-        <w:t xml:space="preserve">, correspondente a 35% de sua remuneração líquida (R$ 3.799,19 em Miguel Alves e R$ 1.172,14 em União), mediante desconto em folha, pelo prazo de </w:t>
-      </w:r>
-      <w:r>
-        <w:rPr>
-          <w:rFonts w:ascii="Lora" w:cs="Lora" w:eastAsia="Lora" w:hAnsi="Lora"/>
-          <w:b/>
-          <w:bCs/>
-        </w:rPr>
-        <w:t xml:space="preserve">60 (sessenta) meses</w:t>
-      </w:r>
-      <w:r>
-        <w:rPr/>
-        <w:t xml:space="preserve">, rateado entre os credores na proporção dos respectivos saldos devedores, a serem apurados após a exibição dos demonstrativos pelos Réus.</w:t>
-      </w:r>
-    </w:p>
-    <w:p>
-      <w:pPr>
-        <w:spacing w:after="60" w:line="360"/>
-        <w:ind w:firstLine="850"/>
-        <w:jc w:val="both"/>
-      </w:pPr>
-      <w:r>
-        <w:rPr/>
-        <w:t xml:space="preserve">Como o montante das dívidas, pelos elementos disponíveis, supera o que o Autor pode pagar em 60 meses sem comprometer o mínimo existencial, requer que o saldo eventualmente remanescente seja pago ao final, nas mesmas condições, sem juros de mora e com a redução dos juros remuneratórios autorizada pelo art. 54-D, parágrafo único, do CDC, solução semelhante à adotada por este Juízo no Processo nº 0800070-46.2025.8.18.0061, em que se determinou o pagamento do saldo remanescente ao final dos contratos, sem juros de mora.</w:t>
-      </w:r>
-    </w:p>
-    <w:p>
-      <w:pPr>
-        <w:spacing w:after="60" w:line="360"/>
-        <w:ind w:firstLine="850"/>
-        <w:jc w:val="both"/>
-      </w:pPr>
-      <w:r>
-        <w:rPr/>
-        <w:t xml:space="preserve">O plano contempla: (i) a dilação dos prazos e a redução dos encargos; (ii) a suspensão das ações judiciais relativas às dívidas abrangidas; (iii) a exclusão do nome do Autor dos cadastros de inadimplentes em até 5 (cinco) dias após a homologação; e (iv) o condicionamento de seus efeitos à abstenção, pelo Autor, de condutas que agravem sua situação (art. 104-A, § 4º, do CDC).</w:t>
+        <w:t xml:space="preserve">, correspondente a 35% da remuneração líquida conjunta dos dois vínculos, distribuída da seguinte forma: </w:t>
+      </w:r>
+      <w:r>
+        <w:rPr>
+          <w:rFonts w:ascii="Lora" w:cs="Lora" w:eastAsia="Lora" w:hAnsi="Lora"/>
+          <w:b/>
+          <w:bCs/>
+        </w:rPr>
+        <w:t xml:space="preserve">R$ 3.799,19</w:t>
+      </w:r>
+      <w:r>
+        <w:rPr/>
+        <w:t xml:space="preserve"> relativamente ao vínculo mantido com o Município de Miguel Alves e </w:t>
+      </w:r>
+      <w:r>
+        <w:rPr>
+          <w:rFonts w:ascii="Lora" w:cs="Lora" w:eastAsia="Lora" w:hAnsi="Lora"/>
+          <w:b/>
+          <w:bCs/>
+        </w:rPr>
+        <w:t xml:space="preserve">R$ 1.172,14</w:t>
+      </w:r>
+      <w:r>
+        <w:rPr/>
+        <w:t xml:space="preserve"> relativamente ao vínculo mantido com o Município de União.</w:t>
+      </w:r>
+    </w:p>
+    <w:p>
+      <w:pPr>
+        <w:spacing w:after="60" w:line="360"/>
+        <w:ind w:firstLine="850"/>
+        <w:jc w:val="both"/>
+      </w:pPr>
+      <w:r>
+        <w:rPr/>
+        <w:t xml:space="preserve">A proposta observa o prazo máximo de 60 meses previsto para o plano de pagamento e será rateada entre os credores conforme os saldos devedores efetivamente apurados, após a apresentação dos contratos, demonstrativos atualizados e demais documentos das operações.</w:t>
+      </w:r>
+    </w:p>
+    <w:p>
+      <w:pPr>
+        <w:spacing w:after="60" w:line="360"/>
+        <w:ind w:firstLine="850"/>
+        <w:jc w:val="both"/>
+      </w:pPr>
+      <w:r>
+        <w:rPr/>
+        <w:t xml:space="preserve">Nos termos do art. 104-A do CDC, o plano poderá contemplar a dilação dos prazos e a redução dos encargos, preservado o mínimo existencial e respeitadas as garantias e formas de pagamento originalmente pactuadas.</w:t>
+      </w:r>
+    </w:p>
+    <w:p>
+      <w:pPr>
+        <w:spacing w:after="60" w:line="360"/>
+        <w:ind w:firstLine="850"/>
+        <w:jc w:val="both"/>
+      </w:pPr>
+      <w:r>
+        <w:rPr/>
+        <w:t xml:space="preserve">Caso a conciliação não seja alcançada, o Autor requer a instauração do processo previsto no art. 104-B do CDC, com revisão e integração dos contratos e elaboração de plano judicial compulsório.</w:t>
+      </w:r>
+    </w:p>
+    <w:p>
+      <w:pPr>
+        <w:spacing w:after="60" w:line="360"/>
+        <w:ind w:firstLine="850"/>
+        <w:jc w:val="both"/>
+      </w:pPr>
+      <w:r>
+        <w:rPr/>
+        <w:t xml:space="preserve">Nesse caso, deverão ser observados os limites legais do plano judicial, especialmente a garantia do principal corrigido monetariamente e a liquidação integral das dívidas no prazo máximo previsto em lei.</w:t>
+      </w:r>
+    </w:p>
+    <w:p>
+      <w:pPr>
+        <w:spacing w:after="60" w:line="360"/>
+        <w:ind w:firstLine="850"/>
+        <w:jc w:val="both"/>
+      </w:pPr>
+      <w:r>
+        <w:rPr/>
+        <w:t xml:space="preserve">A redução dos juros remuneratórios, encargos e acréscimos deverá ser apreciada conforme a conduta de cada fornecedor, especialmente diante dos indícios de concessão sucessiva de crédito sem adequada avaliação da capacidade de pagamento do Autor, nos termos do art. 54-D, parágrafo único, do CDC.</w:t>
       </w:r>
     </w:p>
     <w:p>
@@ -1884,7 +2103,7 @@
       </w:r>
       <w:r>
         <w:rPr/>
-        <w:t xml:space="preserve"> (R$ 3.799,19 em Miguel Alves e R$ 1.172,14 em União), com rateio proporcional entre os contratos e solidariedade dos Réus na observância do limite, oficiando-se à Secretaria Municipal de Educação de Miguel Alves e ao Município de União; (ii) determinar ao Banco do Brasil que se abstenha de debitar da conta corrente do Autor parcelas de empréstimos, de reter seu 13º salário para quitação das antecipações contratadas e de lançar novos “empréstimos” automáticos para cobertura de parcelas; (iii) determinar aos Réus que se abstenham de inscrever o nome do Autor em cadastros de inadimplentes, ou que excluam as inscrições existentes, quanto às dívidas objeto desta ação; e (iv) suspender a exigibilidade dos valores excedentes, sem encargos moratórios, tudo sob pena de multa por ato de descumprimento (art. 537 do CPC);</w:t>
+        <w:t xml:space="preserve"> (R$ 3.799,19 em Miguel Alves e R$ 1.172,14 em União), com rateio proporcional entre os contratos e solidariedade dos Réus na observância do limite, oficiando-se à Secretaria Municipal de Educação de Miguel Alves e ao Município de União; (ii) determinar ao Banco do Brasil que se abstenha provisoriamente de realizar débitos automáticos em conta corrente que inviabilizem a manutenção das despesas essenciais do Autor, sem prejuízo da posterior apuração dos valores devidos; (iii) determinar aos Réus que se abstenham de inscrever o nome do Autor em cadastros de inadimplentes, ou que excluam as inscrições existentes, quanto às dívidas objeto desta ação; e (iv) suspender a exigibilidade dos valores excedentes, sem encargos moratórios, tudo sob pena de multa por ato de descumprimento (art. 537 do CPC);</w:t>
       </w:r>
     </w:p>
     <w:p>
@@ -1974,7 +2193,7 @@
       </w:r>
       <w:r>
         <w:rPr/>
-        <w:t xml:space="preserve"> (art. 104-B do CDC), com a redução de juros e encargos prevista no art. 54-D, parágrafo único, do CDC e o pagamento do saldo remanescente ao final, sem juros de mora;</w:t>
+        <w:t xml:space="preserve"> (art. 104-B do CDC), observados os limites do art. 104-B, § 4º, e com a redução de juros, encargos e acréscimos prevista no art. 54-D, parágrafo único, do CDC;</w:t>
       </w:r>
     </w:p>
     <w:p>
@@ -2023,185 +2242,6 @@
       <w:r>
         <w:rPr/>
         <w:t xml:space="preserve">, correspondente à soma dos valores liberados nos contratos do Banco do Brasil (R$ 345.206,06) e do saldo vencido junto ao Bradesco (R$ 93.223,57), sem prejuízo de sua retificação após a exibição dos demonstrativos de saldo devedor.</w:t>
-      </w:r>
-    </w:p>
-    <w:p>
-      <w:pPr>
-        <w:spacing w:after="60" w:line="360"/>
-        <w:ind w:firstLine="850"/>
-        <w:jc w:val="both"/>
-      </w:pPr>
-      <w:r>
-        <w:rPr/>
-        <w:t xml:space="preserve">Instruem a inicial os seguintes documentos:</w:t>
-      </w:r>
-    </w:p>
-    <w:p>
-      <w:pPr>
-        <w:tabs>
-          <w:tab w:val="left" w:pos="1000"/>
-        </w:tabs>
-        <w:spacing w:after="60" w:line="360"/>
-        <w:ind w:left="1000" w:hanging="400"/>
-        <w:jc w:val="both"/>
-      </w:pPr>
-      <w:r>
-        <w:rPr/>
-        <w:t xml:space="preserve">Doc.	01. procuração;</w:t>
-      </w:r>
-    </w:p>
-    <w:p>
-      <w:pPr>
-        <w:tabs>
-          <w:tab w:val="left" w:pos="1000"/>
-        </w:tabs>
-        <w:spacing w:after="60" w:line="360"/>
-        <w:ind w:left="1000" w:hanging="400"/>
-        <w:jc w:val="both"/>
-      </w:pPr>
-      <w:r>
-        <w:rPr/>
-        <w:t xml:space="preserve">Doc.	02. documento de identificação do Autor;</w:t>
-      </w:r>
-    </w:p>
-    <w:p>
-      <w:pPr>
-        <w:tabs>
-          <w:tab w:val="left" w:pos="1000"/>
-        </w:tabs>
-        <w:spacing w:after="60" w:line="360"/>
-        <w:ind w:left="1000" w:hanging="400"/>
-        <w:jc w:val="both"/>
-      </w:pPr>
-      <w:r>
-        <w:rPr/>
-        <w:t xml:space="preserve">Doc.	03. comprovante de residência (fatura de internet em nome do Autor);</w:t>
-      </w:r>
-    </w:p>
-    <w:p>
-      <w:pPr>
-        <w:tabs>
-          <w:tab w:val="left" w:pos="1000"/>
-        </w:tabs>
-        <w:spacing w:after="60" w:line="360"/>
-        <w:ind w:left="1000" w:hanging="400"/>
-        <w:jc w:val="both"/>
-      </w:pPr>
-      <w:r>
-        <w:rPr/>
-        <w:t xml:space="preserve">Doc.	04. declaração de hipossuficiência;</w:t>
-      </w:r>
-    </w:p>
-    <w:p>
-      <w:pPr>
-        <w:tabs>
-          <w:tab w:val="left" w:pos="1000"/>
-        </w:tabs>
-        <w:spacing w:after="60" w:line="360"/>
-        <w:ind w:left="1000" w:hanging="400"/>
-        <w:jc w:val="both"/>
-      </w:pPr>
-      <w:r>
-        <w:rPr/>
-        <w:t xml:space="preserve">Doc.	05. contracheques do Município de Miguel Alves (março, abril, maio, julho, agosto e setembro de 2026);</w:t>
-      </w:r>
-    </w:p>
-    <w:p>
-      <w:pPr>
-        <w:tabs>
-          <w:tab w:val="left" w:pos="1000"/>
-        </w:tabs>
-        <w:spacing w:after="60" w:line="360"/>
-        <w:ind w:left="1000" w:hanging="400"/>
-        <w:jc w:val="both"/>
-      </w:pPr>
-      <w:r>
-        <w:rPr/>
-        <w:t xml:space="preserve">Doc.	06. contracheques do Município de União (março a setembro de 2026);</w:t>
-      </w:r>
-    </w:p>
-    <w:p>
-      <w:pPr>
-        <w:tabs>
-          <w:tab w:val="left" w:pos="1000"/>
-        </w:tabs>
-        <w:spacing w:after="60" w:line="360"/>
-        <w:ind w:left="1000" w:hanging="400"/>
-        <w:jc w:val="both"/>
-      </w:pPr>
-      <w:r>
-        <w:rPr/>
-        <w:t xml:space="preserve">Doc.	07. Declaração de Margem Consignável emitida pela Secretaria Municipal de Educação de Miguel Alves em 07/10/2026;</w:t>
-      </w:r>
-    </w:p>
-    <w:p>
-      <w:pPr>
-        <w:tabs>
-          <w:tab w:val="left" w:pos="1000"/>
-        </w:tabs>
-        <w:spacing w:after="60" w:line="360"/>
-        <w:ind w:left="1000" w:hanging="400"/>
-        <w:jc w:val="both"/>
-      </w:pPr>
-      <w:r>
-        <w:rPr/>
-        <w:t xml:space="preserve">Doc.	08. telas do aplicativo do Banco do Brasil com os contratos ativos (“Meus empréstimos” e detalhes de cada operação);</w:t>
-      </w:r>
-    </w:p>
-    <w:p>
-      <w:pPr>
-        <w:tabs>
-          <w:tab w:val="left" w:pos="1000"/>
-        </w:tabs>
-        <w:spacing w:after="60" w:line="360"/>
-        <w:ind w:left="1000" w:hanging="400"/>
-        <w:jc w:val="both"/>
-      </w:pPr>
-      <w:r>
-        <w:rPr/>
-        <w:t xml:space="preserve">Doc.	09. extratos da conta corrente do Banco do Brasil (agência 2298-5, conta 6198-0) de março a setembro de 2026, incluindo os lançamentos futuros de junho e agosto de 2026;</w:t>
-      </w:r>
-    </w:p>
-    <w:p>
-      <w:pPr>
-        <w:tabs>
-          <w:tab w:val="left" w:pos="1000"/>
-        </w:tabs>
-        <w:spacing w:after="60" w:line="360"/>
-        <w:ind w:left="1000" w:hanging="400"/>
-        <w:jc w:val="both"/>
-      </w:pPr>
-      <w:r>
-        <w:rPr/>
-        <w:t xml:space="preserve">Doc.	10. extratos da conta do Bradesco (agência 5792, conta 231325-1) e tela de “Operações Vencidas” de 14/10/2026;</w:t>
-      </w:r>
-    </w:p>
-    <w:p>
-      <w:pPr>
-        <w:tabs>
-          <w:tab w:val="left" w:pos="1000"/>
-        </w:tabs>
-        <w:spacing w:after="60" w:line="360"/>
-        <w:ind w:left="1000" w:hanging="400"/>
-        <w:jc w:val="both"/>
-      </w:pPr>
-      <w:r>
-        <w:rPr/>
-        <w:t xml:space="preserve">Doc.	11. comprovantes de despesas essenciais (energia, água e mensalidades escolares);</w:t>
-      </w:r>
-    </w:p>
-    <w:p>
-      <w:pPr>
-        <w:tabs>
-          <w:tab w:val="left" w:pos="1000"/>
-        </w:tabs>
-        <w:spacing w:after="60" w:line="360"/>
-        <w:ind w:left="1000" w:hanging="400"/>
-        <w:jc w:val="both"/>
-      </w:pPr>
-      <w:r>
-        <w:rPr/>
-        <w:t xml:space="preserve">Doc.	12. cópia do acórdão do Agravo de Instrumento nº 0757054-31.2025.8.18.0000 e da sentença do Processo nº 0800070-46.2025.8.18.0061.</w:t>
       </w:r>
     </w:p>
     <w:p>

</xml_diff>

<commit_message>
Inicial Francisco: ADPFs 1.005/1.006/1.097 (consignado na aferição do mínimo existencial), art. 187 CC, limites do 104-B (REsp 2.271.463) e pedido subsidiário pelo art. 54-D
Co-Authored-By: Claude Opus 5.5 <noreply@anthropic.com>
Claude-Session: https://claude.ai/code/session_01EVatDVNz5NJ1N9yNUnzyHx
</commit_message>
<xml_diff>
--- a/Francisco Bernardo Sousa Santos - Superendividamento/Inicial - Repactuação de dívidas - Francisco Bernardo Sousa Santos.docx
+++ b/Francisco Bernardo Sousa Santos - Superendividamento/Inicial - Repactuação de dívidas - Francisco Bernardo Sousa Santos.docx
@@ -1566,60 +1566,7 @@
       </w:pPr>
       <w:r>
         <w:rPr/>
-        <w:t xml:space="preserve">O mínimo existencial deve ser aferido no caso concreto. O valor fixado pelo Decreto nº 11.150/2022, com a redação do Decreto nº 11.567/2023, não pode ser tomado como parâmetro absoluto, sob pena de esvaziar a finalidade protetiva da Lei nº 14.181/2021, tanto que é objeto de questionamento no Supremo Tribunal Federal (ADPFs 1005 e 1006).</w:t>
-      </w:r>
-    </w:p>
-    <w:p>
-      <w:pPr>
-        <w:keepNext/>
-        <w:tabs>
-          <w:tab w:val="left" w:pos="700"/>
-        </w:tabs>
-        <w:spacing w:after="160" w:before="240" w:line="360"/>
-        <w:ind w:left="700" w:hanging="400"/>
-      </w:pPr>
-      <w:r>
-        <w:rPr>
-          <w:rFonts w:ascii="Lora" w:cs="Lora" w:eastAsia="Lora" w:hAnsi="Lora"/>
-          <w:b/>
-          <w:bCs/>
-          <w:i/>
-          <w:iCs/>
-        </w:rPr>
-        <w:t xml:space="preserve">c.	Da margem consignável e da concessão irresponsável de crédito:</w:t>
-      </w:r>
-    </w:p>
-    <w:p>
-      <w:pPr>
-        <w:spacing w:after="60" w:line="360"/>
-        <w:ind w:firstLine="850"/>
-        <w:jc w:val="both"/>
-      </w:pPr>
-      <w:r>
-        <w:rPr/>
-        <w:t xml:space="preserve">O art. 6º, XI, do CDC assegura ao consumidor “a garantia de práticas de crédito responsável”, e o art. 54-D, II, impõe ao fornecedor o dever de, previamente à contratação, “avaliar, de forma responsável, as condições de crédito do consumidor”.</w:t>
-      </w:r>
-    </w:p>
-    <w:p>
-      <w:pPr>
-        <w:spacing w:after="60" w:line="360"/>
-        <w:ind w:firstLine="850"/>
-        <w:jc w:val="both"/>
-      </w:pPr>
-      <w:r>
-        <w:rPr/>
-        <w:t xml:space="preserve">A margem consignável não é parâmetro criado pelo Judiciário. Trata-se de limite legal, aplicado por analogia pela jurisprudência, que deveria ter sido observado no momento da concessão do crédito, como expressão do dever de avaliar a capacidade de pagamento. No caso, os próprios contracheques demonstram que os descontos superam a margem em ambos os vínculos: em Miguel Alves, a margem residual é de R$ 1,26, como atesta declaração formal do órgão pagador; em União, o desconto do Bradesco (R$ 2.266,17) é quase o dobro da margem informada pelo órgão pagador (R$ 1.168,24).</w:t>
-      </w:r>
-    </w:p>
-    <w:p>
-      <w:pPr>
-        <w:spacing w:after="60" w:line="360"/>
-        <w:ind w:firstLine="850"/>
-        <w:jc w:val="both"/>
-      </w:pPr>
-      <w:r>
-        <w:rPr/>
-        <w:t xml:space="preserve">Em caso idêntico, envolvendo professora da rede municipal de Miguel Alves e os mesmos Réus, o Egrégio Tribunal de Justiça do Piauí, no Agravo de Instrumento nº 0757054-31.2025.8.18.0000, de relatoria do Exmo. Des. José Wilson Ferreira de Araújo Júnior, confirmado pelo colegiado, limitou os descontos a 35% da remuneração líquida, reconhecendo que os contracheques constituíam “prova documental robusta e coerente com os fatos narrados” e que a retenção dos vencimentos colocava a consumidora “em estado de vulnerabilidade social extrema”. A sentença proferida por este Juízo naqueles autos (Processo nº 0800070-46.2025.8.18.0061) confirmou a limitação, de forma solidária, e assentou:</w:t>
+        <w:t xml:space="preserve">O Supremo Tribunal Federal, no julgamento conjunto das ADPFs 1.005, 1.006 e 1.097, reconheceu a constitucionalidade do parâmetro quantitativo do mínimo existencial fixado no Decreto nº 11.150/2022, mas declarou inconstitucional a alínea “h” do inciso I do parágrafo único de seu art. 4º, que excluía da aferição do mínimo existencial as parcelas de crédito consignado:</w:t>
       </w:r>
     </w:p>
     <w:p>
@@ -1637,18 +1584,148 @@
           <w:sz w:val="18"/>
           <w:szCs w:val="18"/>
         </w:rPr>
-        <w:t xml:space="preserve">“A concessão sucessiva de crédito, sem uma avaliação criteriosa e global da capacidade de pagamento da consumidora, revela uma falha no dever de cuidado por parte das instituições financeiras. A busca incessante pelo lucro não pode se sobrepor à responsabilidade social e à boa-fé objetiva, que devem nortear a concessão de crédito (art. 54-D, CDC).”</w:t>
-      </w:r>
-    </w:p>
-    <w:p>
-      <w:pPr>
-        <w:spacing w:after="60" w:line="360"/>
-        <w:ind w:firstLine="850"/>
-        <w:jc w:val="both"/>
-      </w:pPr>
-      <w:r>
-        <w:rPr/>
-        <w:t xml:space="preserve">O mesmo se verifica aqui, com o agravante de que o Banco do Brasil celebrou três consignados em um único mês, com margem de R$ 1,26, usando-os para quitar seus próprios contratos, concedeu quatro antecipações de 13º salário no mesmo dia e passou a lançar “empréstimos” automáticos para cobrir parcelas de outros empréstimos. O descumprimento dos deveres de crédito responsável autoriza a redução dos juros e encargos e a dilação do prazo de pagamento (art. 54-D, parágrafo único, do CDC).</w:t>
+        <w:t xml:space="preserve">“6.2. A única exceção diz respeito à alínea h do inciso I do parágrafo único do art. 4º do Decreto nº 11.150, de 2022, que exclui da aferição da preservação e do não comprometimento do mínimo existencial as parcelas das dívidas ‘decorrentes de operação de crédito consignado regido por lei específica’. Sobre os débitos decorrentes de operações de crédito consignado, esses, não raras vezes, são contraídos justamente para fazer frente a dívidas de consumo previstas no caput do art. 3º do Decreto nº 11.150, de 2022. </w:t>
+      </w:r>
+      <w:r>
+        <w:rPr>
+          <w:sz w:val="18"/>
+          <w:szCs w:val="18"/>
+          <w:rFonts w:ascii="Lora" w:cs="Lora" w:eastAsia="Lora" w:hAnsi="Lora"/>
+          <w:b/>
+          <w:bCs/>
+        </w:rPr>
+        <w:t xml:space="preserve">Por essa razão, sua expressa exclusão para fins de cálculo do mínimo existencial viola a proteção constitucional do consumidor (art. 5º, inciso XXXII, da Constituição).</w:t>
+      </w:r>
+      <w:r>
+        <w:rPr>
+          <w:sz w:val="18"/>
+          <w:szCs w:val="18"/>
+        </w:rPr>
+        <w:t xml:space="preserve">” (STF – ADPF 1.006/DF, Rel. Min. André Mendonça, Tribunal Pleno, j. 23/04/2026, DJe 14/10/2026)</w:t>
+      </w:r>
+    </w:p>
+    <w:p>
+      <w:pPr>
+        <w:spacing w:after="60" w:line="360"/>
+        <w:ind w:firstLine="850"/>
+        <w:jc w:val="both"/>
+      </w:pPr>
+      <w:r>
+        <w:rPr/>
+        <w:t xml:space="preserve">Computados os consignados, como determina o Supremo Tribunal Federal, o mínimo existencial do Autor não está preservado, ainda que observado o parâmetro regulamentar:</w:t>
+      </w:r>
+    </w:p>
+    <w:p>
+      <w:pPr>
+        <w:tabs>
+          <w:tab w:val="left" w:pos="1000"/>
+        </w:tabs>
+        <w:spacing w:after="60" w:line="360"/>
+        <w:ind w:left="1000" w:hanging="400"/>
+        <w:jc w:val="both"/>
+      </w:pPr>
+      <w:r>
+        <w:rPr/>
+        <w:t xml:space="preserve">1.	da remuneração líquida dos dois vínculos (</w:t>
+      </w:r>
+      <w:r>
+        <w:rPr>
+          <w:rFonts w:ascii="Lora" w:cs="Lora" w:eastAsia="Lora" w:hAnsi="Lora"/>
+          <w:b/>
+          <w:bCs/>
+        </w:rPr>
+        <w:t xml:space="preserve">R$ 14.203,80</w:t>
+      </w:r>
+      <w:r>
+        <w:rPr/>
+        <w:t xml:space="preserve">), deduzida a pensão alimentícia judicial (R$ 2.899,61), resta ao Autor renda de </w:t>
+      </w:r>
+      <w:r>
+        <w:rPr>
+          <w:rFonts w:ascii="Lora" w:cs="Lora" w:eastAsia="Lora" w:hAnsi="Lora"/>
+          <w:b/>
+          <w:bCs/>
+        </w:rPr>
+        <w:t xml:space="preserve">R$ 11.304,19</w:t>
+      </w:r>
+      <w:r>
+        <w:rPr/>
+        <w:t xml:space="preserve">;</w:t>
+      </w:r>
+    </w:p>
+    <w:p>
+      <w:pPr>
+        <w:tabs>
+          <w:tab w:val="left" w:pos="1000"/>
+        </w:tabs>
+        <w:spacing w:after="60" w:line="360"/>
+        <w:ind w:left="1000" w:hanging="400"/>
+        <w:jc w:val="both"/>
+      </w:pPr>
+      <w:r>
+        <w:rPr/>
+        <w:t xml:space="preserve">2.	os consignados em folha (R$ 7.307,70) e as parcelas cobradas em conta corrente pelo Banco do Brasil (R$ 2.995,63) consomem </w:t>
+      </w:r>
+      <w:r>
+        <w:rPr>
+          <w:rFonts w:ascii="Lora" w:cs="Lora" w:eastAsia="Lora" w:hAnsi="Lora"/>
+          <w:b/>
+          <w:bCs/>
+        </w:rPr>
+        <w:t xml:space="preserve">R$ 10.303,33</w:t>
+      </w:r>
+      <w:r>
+        <w:rPr/>
+        <w:t xml:space="preserve"> dessa renda;</w:t>
+      </w:r>
+    </w:p>
+    <w:p>
+      <w:pPr>
+        <w:tabs>
+          <w:tab w:val="left" w:pos="1000"/>
+        </w:tabs>
+        <w:spacing w:after="60" w:line="360"/>
+        <w:ind w:left="1000" w:hanging="400"/>
+        <w:jc w:val="both"/>
+      </w:pPr>
+      <w:r>
+        <w:rPr/>
+        <w:t xml:space="preserve">3.	somadas as parcelas vencidas e exigíveis do Bradesco (R$ 4.034,03), as obrigações mensais alcançam </w:t>
+      </w:r>
+      <w:r>
+        <w:rPr>
+          <w:rFonts w:ascii="Lora" w:cs="Lora" w:eastAsia="Lora" w:hAnsi="Lora"/>
+          <w:b/>
+          <w:bCs/>
+        </w:rPr>
+        <w:t xml:space="preserve">R$ 14.337,36</w:t>
+      </w:r>
+      <w:r>
+        <w:rPr/>
+        <w:t xml:space="preserve">, e o resultado é </w:t>
+      </w:r>
+      <w:r>
+        <w:rPr>
+          <w:rFonts w:ascii="Lora" w:cs="Lora" w:eastAsia="Lora" w:hAnsi="Lora"/>
+          <w:b/>
+          <w:bCs/>
+        </w:rPr>
+        <w:t xml:space="preserve">negativo em R$ 3.033,17</w:t>
+      </w:r>
+      <w:r>
+        <w:rPr/>
+        <w:t xml:space="preserve"> — ou em R$ 133,56, mesmo que não se deduza a pensão alimentícia —, sem contar os R$ 21.646,35 das antecipações de 13º salário já vencidas.</w:t>
+      </w:r>
+    </w:p>
+    <w:p>
+      <w:pPr>
+        <w:spacing w:after="60" w:line="360"/>
+        <w:ind w:firstLine="850"/>
+        <w:jc w:val="both"/>
+      </w:pPr>
+      <w:r>
+        <w:rPr/>
+        <w:t xml:space="preserve">Não há, portanto, qualquer parcela da renda do Autor resguardada para sua subsistência, o que caracteriza o superendividamento nos exatos termos do art. 54-A, § 1º, do CDC e da regulamentação validada pelo Supremo Tribunal Federal.</w:t>
       </w:r>
     </w:p>
     <w:p>
@@ -1668,138 +1745,40 @@
           <w:i/>
           <w:iCs/>
         </w:rPr>
-        <w:t xml:space="preserve">d.	Da repactuação das dívidas:</w:t>
-      </w:r>
-    </w:p>
-    <w:p>
-      <w:pPr>
-        <w:spacing w:after="60" w:line="360"/>
-        <w:ind w:firstLine="850"/>
-        <w:jc w:val="both"/>
-      </w:pPr>
-      <w:r>
-        <w:rPr/>
-        <w:t xml:space="preserve">O art. 104-A do CDC autoriza o consumidor superendividado a requerer a instauração de processo de repactuação de dívidas, com audiência conciliatória na qual apresentará plano de pagamento com prazo máximo de 5 (cinco) anos, preservado o mínimo existencial. O não comparecimento injustificado do credor acarreta a suspensão da exigibilidade do débito, a interrupção dos encargos da mora e a sujeição compulsória ao plano (art. 104-A, § 2º). Frustrada a conciliação, instaura-se, a pedido do consumidor, processo para revisão e integração dos contratos e repactuação das dívidas remanescentes mediante plano judicial compulsório (art. 104-B).</w:t>
-      </w:r>
-    </w:p>
-    <w:p>
-      <w:pPr>
-        <w:spacing w:after="60" w:line="360"/>
-        <w:ind w:firstLine="850"/>
-        <w:jc w:val="both"/>
-      </w:pPr>
-      <w:r>
-        <w:rPr/>
-        <w:t xml:space="preserve">As dívidas objeto desta ação decorrem de crédito pessoal, consignado e serviços bancários, e não se enquadram nas exclusões do art. 104-A, § 1º, do CDC.</w:t>
-      </w:r>
-    </w:p>
-    <w:p>
-      <w:pPr>
-        <w:keepNext/>
-        <w:tabs>
-          <w:tab w:val="left" w:pos="700"/>
-        </w:tabs>
-        <w:spacing w:after="160" w:before="240" w:line="360"/>
-        <w:ind w:left="700" w:hanging="400"/>
-      </w:pPr>
-      <w:r>
-        <w:rPr>
-          <w:rFonts w:ascii="Lora" w:cs="Lora" w:eastAsia="Lora" w:hAnsi="Lora"/>
-          <w:b/>
-          <w:bCs/>
-          <w:i/>
-          <w:iCs/>
-        </w:rPr>
-        <w:t xml:space="preserve">e.	Do Tema 1.085 do STJ:</w:t>
-      </w:r>
-    </w:p>
-    <w:p>
-      <w:pPr>
-        <w:spacing w:after="60" w:line="360"/>
-        <w:ind w:firstLine="850"/>
-        <w:jc w:val="both"/>
-      </w:pPr>
-      <w:r>
-        <w:rPr/>
-        <w:t xml:space="preserve">O Tema 1.085 do STJ (REsp 1.863.973/SP) não obsta a pretensão. Não se pretende a aplicação analógica do limite de consignação a descontos em conta corrente de forma isolada, mas a repactuação global das dívidas de consumidor superendividado, com fundamento na Lei nº 14.181/2021. Quanto aos consignados em folha, o excesso decorre da própria superação da margem informada pelos órgãos pagadores.</w:t>
-      </w:r>
-    </w:p>
-    <w:p>
-      <w:pPr>
-        <w:keepNext/>
-        <w:shd w:fill="123BB8" w:color="auto" w:val="clear"/>
-        <w:tabs>
-          <w:tab w:val="left" w:pos="1000"/>
-        </w:tabs>
-        <w:spacing w:after="240" w:before="240" w:line="240"/>
-        <w:ind w:left="0" w:firstLine="0"/>
-      </w:pPr>
-      <w:r>
-        <w:rPr>
-          <w:rFonts w:ascii="Lora" w:cs="Lora" w:eastAsia="Lora" w:hAnsi="Lora"/>
-          <w:b/>
-          <w:bCs/>
-          <w:i/>
-          <w:iCs/>
-          <w:color w:val="FFFFFF"/>
-        </w:rPr>
-        <w:t xml:space="preserve">	Da tutela de urgência.</w:t>
-      </w:r>
-    </w:p>
-    <w:p>
-      <w:pPr>
-        <w:spacing w:after="60" w:line="360"/>
-        <w:ind w:firstLine="850"/>
-        <w:jc w:val="both"/>
-      </w:pPr>
-      <w:r>
-        <w:rPr/>
-        <w:t xml:space="preserve">A tutela de urgência deve ser apreciada à luz do art. 300 do CPC, que exige a presença concomitante da probabilidade do direito e do perigo de dano ou risco ao resultado útil do processo.</w:t>
-      </w:r>
-    </w:p>
-    <w:p>
-      <w:pPr>
-        <w:spacing w:after="60" w:line="360"/>
-        <w:ind w:firstLine="850"/>
-        <w:jc w:val="both"/>
-      </w:pPr>
-      <w:r>
-        <w:rPr/>
-        <w:t xml:space="preserve">No caso, a probabilidade do direito decorre dos contracheques, da declaração de margem consignável e dos extratos bancários, que demonstram comprometimento expressivo da renda do Autor, inclusive com lançamentos destinados à contratação automática de novos créditos para cobertura de parcelas anteriores.</w:t>
-      </w:r>
-    </w:p>
-    <w:p>
-      <w:pPr>
-        <w:spacing w:after="60" w:line="360"/>
-        <w:ind w:firstLine="850"/>
-        <w:jc w:val="both"/>
-      </w:pPr>
-      <w:r>
-        <w:rPr/>
-        <w:t xml:space="preserve">Quanto aos descontos realizados diretamente em folha de pagamento, requer-se a limitação provisória ao percentual de </w:t>
-      </w:r>
-      <w:r>
-        <w:rPr>
-          <w:rFonts w:ascii="Lora" w:cs="Lora" w:eastAsia="Lora" w:hAnsi="Lora"/>
-          <w:b/>
-          <w:bCs/>
-        </w:rPr>
-        <w:t xml:space="preserve">35% da remuneração líquida de cada vínculo</w:t>
-      </w:r>
-      <w:r>
-        <w:rPr/>
-        <w:t xml:space="preserve">, observadas as margens consignáveis informadas pelos próprios órgãos pagadores.</w:t>
-      </w:r>
-    </w:p>
-    <w:p>
-      <w:pPr>
-        <w:spacing w:after="60" w:line="360"/>
-        <w:ind w:firstLine="850"/>
-        <w:jc w:val="both"/>
-      </w:pPr>
-      <w:r>
-        <w:rPr/>
-        <w:t xml:space="preserve">A pretensão relativa aos débitos em conta corrente não se funda na aplicação analógica do limite legal dos empréstimos consignados. O Tema 1.085 do STJ afasta essa aplicação analógica aos empréstimos bancários comuns autorizados em conta corrente. No REsp 1.863.973/SP, julgado pela Segunda Seção do STJ em 09/03/2022 e publicado em 15/03/2022, foi fixada tese repetitiva nesse sentido:</w:t>
+        <w:t xml:space="preserve">c.	Da margem consignável e da concessão irresponsável de crédito:</w:t>
+      </w:r>
+    </w:p>
+    <w:p>
+      <w:pPr>
+        <w:spacing w:after="60" w:line="360"/>
+        <w:ind w:firstLine="850"/>
+        <w:jc w:val="both"/>
+      </w:pPr>
+      <w:r>
+        <w:rPr/>
+        <w:t xml:space="preserve">O art. 6º, XI, do CDC assegura ao consumidor “a garantia de práticas de crédito responsável”, e o art. 54-D, II, impõe ao fornecedor o dever de, previamente à contratação, “avaliar, de forma responsável, as condições de crédito do consumidor”.</w:t>
+      </w:r>
+    </w:p>
+    <w:p>
+      <w:pPr>
+        <w:spacing w:after="60" w:line="360"/>
+        <w:ind w:firstLine="850"/>
+        <w:jc w:val="both"/>
+      </w:pPr>
+      <w:r>
+        <w:rPr/>
+        <w:t xml:space="preserve">A margem consignável não é parâmetro criado pelo Judiciário. Trata-se de limite legal, aplicado por analogia pela jurisprudência, que deveria ter sido observado no momento da concessão do crédito, como expressão do dever de avaliar a capacidade de pagamento. No caso, os próprios contracheques demonstram que os descontos superam a margem em ambos os vínculos: em Miguel Alves, a margem residual é de R$ 1,26, como atesta declaração formal do órgão pagador; em União, o desconto do Bradesco (R$ 2.266,17) é quase o dobro da margem informada pelo órgão pagador (R$ 1.168,24).</w:t>
+      </w:r>
+    </w:p>
+    <w:p>
+      <w:pPr>
+        <w:spacing w:after="60" w:line="360"/>
+        <w:ind w:firstLine="850"/>
+        <w:jc w:val="both"/>
+      </w:pPr>
+      <w:r>
+        <w:rPr/>
+        <w:t xml:space="preserve">Em caso idêntico, envolvendo professora da rede municipal de Miguel Alves e os mesmos Réus, o Egrégio Tribunal de Justiça do Piauí, no Agravo de Instrumento nº 0757054-31.2025.8.18.0000, de relatoria do Exmo. Des. José Wilson Ferreira de Araújo Júnior, confirmado pelo colegiado, limitou os descontos a 35% da remuneração líquida, reconhecendo que os contracheques constituíam “prova documental robusta e coerente com os fatos narrados” e que a retenção dos vencimentos colocava a consumidora “em estado de vulnerabilidade social extrema”. A sentença proferida por este Juízo naqueles autos (Processo nº 0800070-46.2025.8.18.0061) confirmou a limitação, de forma solidária, e assentou:</w:t>
       </w:r>
     </w:p>
     <w:p>
@@ -1817,6 +1796,197 @@
           <w:sz w:val="18"/>
           <w:szCs w:val="18"/>
         </w:rPr>
+        <w:t xml:space="preserve">“A concessão sucessiva de crédito, sem uma avaliação criteriosa e global da capacidade de pagamento da consumidora, revela uma falha no dever de cuidado por parte das instituições financeiras. A busca incessante pelo lucro não pode se sobrepor à responsabilidade social e à boa-fé objetiva, que devem nortear a concessão de crédito (art. 54-D, CDC).”</w:t>
+      </w:r>
+    </w:p>
+    <w:p>
+      <w:pPr>
+        <w:spacing w:after="60" w:line="360"/>
+        <w:ind w:firstLine="850"/>
+        <w:jc w:val="both"/>
+      </w:pPr>
+      <w:r>
+        <w:rPr/>
+        <w:t xml:space="preserve">O mesmo se verifica aqui, com o agravante de que o Banco do Brasil celebrou três consignados em um único mês, com margem de R$ 1,26, usando-os para quitar seus próprios contratos, concedeu quatro antecipações de 13º salário no mesmo dia e passou a lançar “empréstimos” automáticos para cobrir parcelas de outros empréstimos. A concessão de crédito acima da margem consignável, com pleno conhecimento da renda e dos descontos já existentes, configura ainda exercício abusivo do direito de contratar (art. 187 do Código Civil).</w:t>
+      </w:r>
+    </w:p>
+    <w:p>
+      <w:pPr>
+        <w:spacing w:after="60" w:line="360"/>
+        <w:ind w:firstLine="850"/>
+        <w:jc w:val="both"/>
+      </w:pPr>
+      <w:r>
+        <w:rPr/>
+        <w:t xml:space="preserve">O descumprimento dos deveres de crédito responsável autoriza, nos termos do art. 54-D, parágrafo único, do CDC, “a redução dos juros, dos encargos ou de qualquer acréscimo ao principal e a dilação do prazo de pagamento previsto no contrato original, conforme a gravidade da conduta do fornecedor e as possibilidades financeiras do consumidor”. Trata-se de sanção autônoma, decorrente da conduta do fornecedor, que não se confunde com o plano judicial compulsório do art. 104-B do CDC e não se submete aos seus limites de prazo.</w:t>
+      </w:r>
+    </w:p>
+    <w:p>
+      <w:pPr>
+        <w:keepNext/>
+        <w:tabs>
+          <w:tab w:val="left" w:pos="700"/>
+        </w:tabs>
+        <w:spacing w:after="160" w:before="240" w:line="360"/>
+        <w:ind w:left="700" w:hanging="400"/>
+      </w:pPr>
+      <w:r>
+        <w:rPr>
+          <w:rFonts w:ascii="Lora" w:cs="Lora" w:eastAsia="Lora" w:hAnsi="Lora"/>
+          <w:b/>
+          <w:bCs/>
+          <w:i/>
+          <w:iCs/>
+        </w:rPr>
+        <w:t xml:space="preserve">d.	Da repactuação das dívidas:</w:t>
+      </w:r>
+    </w:p>
+    <w:p>
+      <w:pPr>
+        <w:spacing w:after="60" w:line="360"/>
+        <w:ind w:firstLine="850"/>
+        <w:jc w:val="both"/>
+      </w:pPr>
+      <w:r>
+        <w:rPr/>
+        <w:t xml:space="preserve">O art. 104-A do CDC autoriza o consumidor superendividado a requerer a instauração de processo de repactuação de dívidas, com audiência conciliatória na qual apresentará plano de pagamento com prazo máximo de 5 (cinco) anos, preservado o mínimo existencial. O não comparecimento injustificado do credor acarreta a suspensão da exigibilidade do débito, a interrupção dos encargos da mora e a sujeição compulsória ao plano (art. 104-A, § 2º). Frustrada a conciliação, instaura-se, a pedido do consumidor, processo para revisão e integração dos contratos e repactuação das dívidas remanescentes mediante plano judicial compulsório (art. 104-B).</w:t>
+      </w:r>
+    </w:p>
+    <w:p>
+      <w:pPr>
+        <w:spacing w:after="60" w:line="360"/>
+        <w:ind w:firstLine="850"/>
+        <w:jc w:val="both"/>
+      </w:pPr>
+      <w:r>
+        <w:rPr/>
+        <w:t xml:space="preserve">As dívidas objeto desta ação decorrem de crédito pessoal, consignado e serviços bancários, e não se enquadram nas exclusões do art. 104-A, § 1º, do CDC.</w:t>
+      </w:r>
+    </w:p>
+    <w:p>
+      <w:pPr>
+        <w:keepNext/>
+        <w:tabs>
+          <w:tab w:val="left" w:pos="700"/>
+        </w:tabs>
+        <w:spacing w:after="160" w:before="240" w:line="360"/>
+        <w:ind w:left="700" w:hanging="400"/>
+      </w:pPr>
+      <w:r>
+        <w:rPr>
+          <w:rFonts w:ascii="Lora" w:cs="Lora" w:eastAsia="Lora" w:hAnsi="Lora"/>
+          <w:b/>
+          <w:bCs/>
+          <w:i/>
+          <w:iCs/>
+        </w:rPr>
+        <w:t xml:space="preserve">e.	Do Tema 1.085 do STJ:</w:t>
+      </w:r>
+    </w:p>
+    <w:p>
+      <w:pPr>
+        <w:spacing w:after="60" w:line="360"/>
+        <w:ind w:firstLine="850"/>
+        <w:jc w:val="both"/>
+      </w:pPr>
+      <w:r>
+        <w:rPr/>
+        <w:t xml:space="preserve">O Tema 1.085 do STJ (REsp 1.863.973/SP) não obsta a pretensão. Não se pretende a aplicação analógica do limite de consignação a descontos em conta corrente de forma isolada, mas a repactuação global das dívidas de consumidor superendividado, com fundamento na Lei nº 14.181/2021. Quanto aos consignados em folha, o excesso decorre da própria superação da margem informada pelos órgãos pagadores.</w:t>
+      </w:r>
+    </w:p>
+    <w:p>
+      <w:pPr>
+        <w:keepNext/>
+        <w:shd w:fill="123BB8" w:color="auto" w:val="clear"/>
+        <w:tabs>
+          <w:tab w:val="left" w:pos="1000"/>
+        </w:tabs>
+        <w:spacing w:after="240" w:before="240" w:line="240"/>
+        <w:ind w:left="0" w:firstLine="0"/>
+      </w:pPr>
+      <w:r>
+        <w:rPr>
+          <w:rFonts w:ascii="Lora" w:cs="Lora" w:eastAsia="Lora" w:hAnsi="Lora"/>
+          <w:b/>
+          <w:bCs/>
+          <w:i/>
+          <w:iCs/>
+          <w:color w:val="FFFFFF"/>
+        </w:rPr>
+        <w:t xml:space="preserve">	Da tutela de urgência.</w:t>
+      </w:r>
+    </w:p>
+    <w:p>
+      <w:pPr>
+        <w:spacing w:after="60" w:line="360"/>
+        <w:ind w:firstLine="850"/>
+        <w:jc w:val="both"/>
+      </w:pPr>
+      <w:r>
+        <w:rPr/>
+        <w:t xml:space="preserve">A tutela de urgência deve ser apreciada à luz do art. 300 do CPC, que exige a presença concomitante da probabilidade do direito e do perigo de dano ou risco ao resultado útil do processo.</w:t>
+      </w:r>
+    </w:p>
+    <w:p>
+      <w:pPr>
+        <w:spacing w:after="60" w:line="360"/>
+        <w:ind w:firstLine="850"/>
+        <w:jc w:val="both"/>
+      </w:pPr>
+      <w:r>
+        <w:rPr/>
+        <w:t xml:space="preserve">No caso, a probabilidade do direito decorre dos contracheques, da declaração de margem consignável e dos extratos bancários, que demonstram comprometimento expressivo da renda do Autor, inclusive com lançamentos destinados à contratação automática de novos créditos para cobertura de parcelas anteriores.</w:t>
+      </w:r>
+    </w:p>
+    <w:p>
+      <w:pPr>
+        <w:spacing w:after="60" w:line="360"/>
+        <w:ind w:firstLine="850"/>
+        <w:jc w:val="both"/>
+      </w:pPr>
+      <w:r>
+        <w:rPr/>
+        <w:t xml:space="preserve">Quanto aos descontos realizados diretamente em folha de pagamento, requer-se a limitação provisória ao percentual de </w:t>
+      </w:r>
+      <w:r>
+        <w:rPr>
+          <w:rFonts w:ascii="Lora" w:cs="Lora" w:eastAsia="Lora" w:hAnsi="Lora"/>
+          <w:b/>
+          <w:bCs/>
+        </w:rPr>
+        <w:t xml:space="preserve">35% da remuneração líquida de cada vínculo</w:t>
+      </w:r>
+      <w:r>
+        <w:rPr/>
+        <w:t xml:space="preserve">, observadas as margens consignáveis informadas pelos próprios órgãos pagadores.</w:t>
+      </w:r>
+    </w:p>
+    <w:p>
+      <w:pPr>
+        <w:spacing w:after="60" w:line="360"/>
+        <w:ind w:firstLine="850"/>
+        <w:jc w:val="both"/>
+      </w:pPr>
+      <w:r>
+        <w:rPr/>
+        <w:t xml:space="preserve">A pretensão relativa aos débitos em conta corrente não se funda na aplicação analógica do limite legal dos empréstimos consignados. O Tema 1.085 do STJ afasta essa aplicação analógica aos empréstimos bancários comuns autorizados em conta corrente. No REsp 1.863.973/SP, julgado pela Segunda Seção do STJ em 09/03/2022 e publicado em 15/03/2022, foi fixada tese repetitiva nesse sentido:</w:t>
+      </w:r>
+    </w:p>
+    <w:p>
+      <w:pPr>
+        <w:pBdr>
+          <w:top w:val="single" w:color="9AA0A6" w:sz="4" w:space="6"/>
+          <w:bottom w:val="single" w:color="9AA0A6" w:sz="4" w:space="6"/>
+        </w:pBdr>
+        <w:spacing w:after="200" w:before="160" w:line="240"/>
+        <w:ind w:left="2270" w:right="570"/>
+        <w:jc w:val="both"/>
+      </w:pPr>
+      <w:r>
+        <w:rPr>
+          <w:sz w:val="18"/>
+          <w:szCs w:val="18"/>
+        </w:rPr>
         <w:t xml:space="preserve">“RECURSO ESPECIAL REPRESENTATIVO DA CONTROVÉRSIA. PRETENSÃO DE LIMITAÇÃO DOS DESCONTOS DAS PARCELAS DE EMPRÉSTIMO COMUM EM CONTA-CORRENTE, EM APLICAÇÃO ANALÓGICA DA LEI N. 10.820/2003 QUE DISCIPLINA OS EMPRÉSTIMOS CONSIGNADOS EM FOLHA DE PAGAMENTO. IMPOSSIBILIDADE. RATIFICAÇÃO DA JURISPRUDÊNCIA DO SUPERIOR TRIBUNAL DE JUSTIÇA, COM FIXAÇÃO DE TESE REPETITIVA. RECURSO ESPECIAL PROVIDO. PREJUDICADO O RECURSO ESPECIAL DA DEMANDANTE, QUE PLEITEAVA A MAJORAÇÃO DA VERBA HONORÁRIA. </w:t>
       </w:r>
       <w:r>
@@ -2011,6 +2181,63 @@
     </w:p>
     <w:p>
       <w:pPr>
+        <w:spacing w:after="60" w:line="360"/>
+        <w:ind w:firstLine="850"/>
+        <w:jc w:val="both"/>
+      </w:pPr>
+      <w:r>
+        <w:rPr/>
+        <w:t xml:space="preserve">O Autor não ignora que o plano judicial compulsório deve assegurar aos credores, no mínimo, o principal corrigido monetariamente, com liquidação no prazo legal (art. 104-B, § 4º, do CDC), conforme recentemente reafirmado pelo Superior Tribunal de Justiça:</w:t>
+      </w:r>
+    </w:p>
+    <w:p>
+      <w:pPr>
+        <w:pBdr>
+          <w:top w:val="single" w:color="9AA0A6" w:sz="4" w:space="6"/>
+          <w:bottom w:val="single" w:color="9AA0A6" w:sz="4" w:space="6"/>
+        </w:pBdr>
+        <w:spacing w:after="200" w:before="160" w:line="240"/>
+        <w:ind w:left="2270" w:right="570"/>
+        <w:jc w:val="both"/>
+      </w:pPr>
+      <w:r>
+        <w:rPr>
+          <w:sz w:val="18"/>
+          <w:szCs w:val="18"/>
+        </w:rPr>
+        <w:t xml:space="preserve">“4. </w:t>
+      </w:r>
+      <w:r>
+        <w:rPr>
+          <w:sz w:val="18"/>
+          <w:szCs w:val="18"/>
+          <w:rFonts w:ascii="Lora" w:cs="Lora" w:eastAsia="Lora" w:hAnsi="Lora"/>
+          <w:b/>
+          <w:bCs/>
+        </w:rPr>
+        <w:t xml:space="preserve">O plano judicial compulsório deve assegurar a cada credor, no mínimo, o valor do principal devido, corrigido monetariamente por índice oficial, e prever a liquidação total da dívida no prazo legal.</w:t>
+      </w:r>
+      <w:r>
+        <w:rPr>
+          <w:sz w:val="18"/>
+          <w:szCs w:val="18"/>
+        </w:rPr>
+        <w:t xml:space="preserve"> É incompatível com o art. 104-B, § 4º, plano que prevê ao recorrente o pagamento nominal de R$ 9.129,54, embora o instrumento contratual registre principal de R$ 33.105,74.” (STJ – REsp 2.271.463/MT, Rel. Min. Maria Isabel Gallotti, Quarta Turma, j. 22/09/2026, DJEN 25/09/2026)</w:t>
+      </w:r>
+    </w:p>
+    <w:p>
+      <w:pPr>
+        <w:spacing w:after="60" w:line="360"/>
+        <w:ind w:firstLine="850"/>
+        <w:jc w:val="both"/>
+      </w:pPr>
+      <w:r>
+        <w:rPr/>
+        <w:t xml:space="preserve">Assim, o Autor requer que o plano, consensual ou judicial, contemple a redução ou exclusão dos juros remuneratórios e moratórios e dos demais encargos, com correção monetária apenas sobre o principal, em parcelas mensais compatíveis com sua renda e com a preservação do mínimo existencial, ficando o valor e a forma definitivos do plano para depois da exibição dos contratos e da apuração dos saldos devedores. Caso os saldos apurados não comportem a liquidação no prazo legal, aplica-se a sanção autônoma do art. 54-D, parágrafo único, do CDC, com a dilação do prazo dos contratos.</w:t>
+      </w:r>
+    </w:p>
+    <w:p>
+      <w:pPr>
         <w:keepNext/>
         <w:shd w:fill="123BB8" w:color="auto" w:val="clear"/>
         <w:tabs>
@@ -2207,7 +2434,33 @@
       </w:pPr>
       <w:r>
         <w:rPr/>
-        <w:t xml:space="preserve">F.	a condenação dos Réus ao pagamento das custas processuais e dos honorários advocatícios de 20% sobre o valor atualizado da causa (art. 85, § 2º, do CPC).</w:t>
+        <w:t xml:space="preserve">F.	subsidiariamente, caso o plano judicial compulsório não comporte a integralidade das dívidas no prazo legal, a aplicação do art. 54-D, parágrafo único, do CDC, em razão da concessão irresponsável de crédito, com: (i) a manutenção da limitação dos descontos consignados a 35% da remuneração líquida de cada vínculo; (ii) a exclusão dos juros moratórios e a redução dos juros remuneratórios e demais encargos, preservada apenas a correção monetária do principal; e (iii) a </w:t>
+      </w:r>
+      <w:r>
+        <w:rPr>
+          <w:rFonts w:ascii="Lora" w:cs="Lora" w:eastAsia="Lora" w:hAnsi="Lora"/>
+          <w:b/>
+          <w:bCs/>
+        </w:rPr>
+        <w:t xml:space="preserve">dilação do prazo dos contratos</w:t>
+      </w:r>
+      <w:r>
+        <w:rPr/>
+        <w:t xml:space="preserve">, com o saldo não amortizado acrescido ao final, em parcelas de igual valor, nos moldes do decidido por este Juízo no Processo nº 0800070-46.2025.8.18.0061;</w:t>
+      </w:r>
+    </w:p>
+    <w:p>
+      <w:pPr>
+        <w:tabs>
+          <w:tab w:val="left" w:pos="1000"/>
+        </w:tabs>
+        <w:spacing w:after="60" w:line="360"/>
+        <w:ind w:left="1000" w:hanging="400"/>
+        <w:jc w:val="both"/>
+      </w:pPr>
+      <w:r>
+        <w:rPr/>
+        <w:t xml:space="preserve">G.	a condenação dos Réus ao pagamento das custas processuais e dos honorários advocatícios de 20% sobre o valor atualizado da causa (art. 85, § 2º, do CPC).</w:t>
       </w:r>
     </w:p>
     <w:p>

</xml_diff>

<commit_message>
Inicial Francisco: incorpora revisão do advogado (pedido F conservador), alinha fundamentação do art. 54-D e inclui RG
Co-Authored-By: Claude Opus 5.5 <noreply@anthropic.com>
Claude-Session: https://claude.ai/code/session_01EVatDVNz5NJ1N9yNUnzyHx
</commit_message>
<xml_diff>
--- a/Francisco Bernardo Sousa Santos - Superendividamento/Inicial - Repactuação de dívidas - Francisco Bernardo Sousa Santos.docx
+++ b/Francisco Bernardo Sousa Santos - Superendividamento/Inicial - Repactuação de dívidas - Francisco Bernardo Sousa Santos.docx
@@ -31,7 +31,7 @@
       </w:r>
       <w:r>
         <w:rPr/>
-        <w:t xml:space="preserve">, brasileiro, divorciado, professor, nascido em 20/08/1979, inscrito no CPF sob o nº 857.729.763-20, residente e domiciliado na Rua Antônio Dias, s/n, Bairro Beira-Rio, Miguel Alves-PI, CEP 64.130-000, por meio de seu advogado, ANTÔNIO DE PÁDUA SANTOS NETO, advogado, inscrito nos quadros da OAB-PI sob o nº 21.320, constituído mediante procuração em anexo, cujo endereço físico está situado na Rua Rio Grande do Sul, nº 1641, Bairro São Miguel, Miguel Alves-PI, CEP nº: 64.130-000 e eletrônico: paduanetojus@gmail.com, vem, respeitosamente, à presença de Vossa Excelência, com fundamento nos arts. 6º, XI e XII, 54-A, 54-D, 104-A e 104-B do Código de Defesa do Consumidor e no art. 300 do Código de Processo Civil, propor a presente</w:t>
+        <w:t xml:space="preserve">, brasileiro, divorciado, professor, nascido em 20/08/1979, portador do RG nº 8012272 SSP/PI, inscrito no CPF sob o nº 857.729.763-20, residente e domiciliado na Rua Antônio Dias, s/n, Bairro Beira-Rio, Miguel Alves-PI, CEP 64.130-000, por meio de seu advogado, ANTÔNIO DE PÁDUA SANTOS NETO, advogado, inscrito nos quadros da OAB-PI sob o nº 21.320, constituído mediante procuração em anexo, cujo endereço físico está situado na Rua Rio Grande do Sul, nº 1641, Bairro São Miguel, Miguel Alves-PI, CEP nº: 64.130-000 e eletrônico: paduanetojus@gmail.com, vem, respeitosamente, à presença de Vossa Excelência, com fundamento nos arts. 6º, XI e XII, 54-A, 54-D, 104-A e 104-B do Código de Defesa do Consumidor e no art. 300 do Código de Processo Civil, propor a presente</w:t>
       </w:r>
     </w:p>
     <w:p>
@@ -1050,7 +1050,7 @@
       </w:r>
       <w:r>
         <w:rPr/>
-        <w:t xml:space="preserve"> do que lhe resta após a pensão alimentícia. Acrescidas as parcelas do Bradesco de Miguel Alves (R$ 4.034,03), chegariam a </w:t>
+        <w:t xml:space="preserve"> do que lhe resta após a pensão alimentícia. Acrescidas as parcelas contratuais do Bradesco relativas aos contratos nº 503906781 e nº 504307147, no valor mensal de R$ 4.034,03, chegariam a </w:t>
       </w:r>
       <w:r>
         <w:rPr>
@@ -1198,7 +1198,7 @@
       </w:pPr>
       <w:r>
         <w:rPr/>
-        <w:t xml:space="preserve">Em troca de 120 parcelas de R$ 4.014,58 — </w:t>
+        <w:t xml:space="preserve">Em troca de 120 parcelas de R$ 4.014,58 (</w:t>
       </w:r>
       <w:r>
         <w:rPr>
@@ -1210,7 +1210,7 @@
       </w:r>
       <w:r>
         <w:rPr/>
-        <w:t xml:space="preserve"> ao final —, o Autor recebeu, em março de 2026, pouco mais de R$ 5.000,00 em dinheiro. Três meses depois, sem qualquer margem, recebeu mais quatro antecipações de 13º salário no mesmo dia, e o padrão se repetiu: em 26/06/2026, mesma data em que creditou os R$ 21.846,71, o banco debitou </w:t>
+        <w:t xml:space="preserve"> ao final), o Autor recebeu, em março de 2026, pouco mais de R$ 5.000,00 em dinheiro. Três meses depois, sem qualquer margem, recebeu mais quatro antecipações de 13º salário no mesmo dia, e o padrão se repetiu, em 26/06/2026, mesma data em que creditou os R$ 21.846,71, o banco debitou </w:t>
       </w:r>
       <w:r>
         <w:rPr>
@@ -1714,7 +1714,7 @@
       </w:r>
       <w:r>
         <w:rPr/>
-        <w:t xml:space="preserve"> — ou em R$ 133,56, mesmo que não se deduza a pensão alimentícia —, sem contar os R$ 21.646,35 das antecipações de 13º salário já vencidas.</w:t>
+        <w:t xml:space="preserve"> (ou em R$ 133,56, mesmo que não se deduza a pensão alimentícia), sem contar os R$ 21.646,35 das antecipações de 13º salário já vencidas.</w:t>
       </w:r>
     </w:p>
     <w:p>
@@ -1818,7 +1818,7 @@
       </w:pPr>
       <w:r>
         <w:rPr/>
-        <w:t xml:space="preserve">O descumprimento dos deveres de crédito responsável autoriza, nos termos do art. 54-D, parágrafo único, do CDC, “a redução dos juros, dos encargos ou de qualquer acréscimo ao principal e a dilação do prazo de pagamento previsto no contrato original, conforme a gravidade da conduta do fornecedor e as possibilidades financeiras do consumidor”. Trata-se de sanção autônoma, decorrente da conduta do fornecedor, que não se confunde com o plano judicial compulsório do art. 104-B do CDC e não se submete aos seus limites de prazo.</w:t>
+        <w:t xml:space="preserve">O descumprimento dos deveres de crédito responsável autoriza, nos termos do art. 54-D, parágrafo único, do CDC, “a redução dos juros, dos encargos ou de qualquer acréscimo ao principal e a dilação do prazo de pagamento previsto no contrato original, conforme a gravidade da conduta do fornecedor e as possibilidades financeiras do consumidor”. Trata-se de sanção decorrente da conduta do fornecedor, a ser considerada na revisão e integração dos contratos e na elaboração do plano de pagamento.</w:t>
       </w:r>
     </w:p>
     <w:p>
@@ -2233,7 +2233,7 @@
       </w:pPr>
       <w:r>
         <w:rPr/>
-        <w:t xml:space="preserve">Assim, o Autor requer que o plano, consensual ou judicial, contemple a redução ou exclusão dos juros remuneratórios e moratórios e dos demais encargos, com correção monetária apenas sobre o principal, em parcelas mensais compatíveis com sua renda e com a preservação do mínimo existencial, ficando o valor e a forma definitivos do plano para depois da exibição dos contratos e da apuração dos saldos devedores. Caso os saldos apurados não comportem a liquidação no prazo legal, aplica-se a sanção autônoma do art. 54-D, parágrafo único, do CDC, com a dilação do prazo dos contratos.</w:t>
+        <w:t xml:space="preserve">Assim, o Autor requer que o plano, consensual ou judicial, contemple a redução ou exclusão dos juros remuneratórios e moratórios e dos demais encargos, com correção monetária apenas sobre o principal, em parcelas mensais compatíveis com sua renda e com a preservação do mínimo existencial, ficando o valor e a forma definitivos do plano para depois da exibição dos contratos e da apuração dos saldos devedores. Caso os saldos apurados não comportem a liquidação no prazo legal, requer-se a aplicação do art. 54-D, parágrafo único, do CDC, com a redução dos juros e encargos e a dilação do prazo na extensão juridicamente admitida.</w:t>
       </w:r>
     </w:p>
     <w:p>
@@ -2434,19 +2434,7 @@
       </w:pPr>
       <w:r>
         <w:rPr/>
-        <w:t xml:space="preserve">F.	subsidiariamente, caso o plano judicial compulsório não comporte a integralidade das dívidas no prazo legal, a aplicação do art. 54-D, parágrafo único, do CDC, em razão da concessão irresponsável de crédito, com: (i) a manutenção da limitação dos descontos consignados a 35% da remuneração líquida de cada vínculo; (ii) a exclusão dos juros moratórios e a redução dos juros remuneratórios e demais encargos, preservada apenas a correção monetária do principal; e (iii) a </w:t>
-      </w:r>
-      <w:r>
-        <w:rPr>
-          <w:rFonts w:ascii="Lora" w:cs="Lora" w:eastAsia="Lora" w:hAnsi="Lora"/>
-          <w:b/>
-          <w:bCs/>
-        </w:rPr>
-        <w:t xml:space="preserve">dilação do prazo dos contratos</w:t>
-      </w:r>
-      <w:r>
-        <w:rPr/>
-        <w:t xml:space="preserve">, com o saldo não amortizado acrescido ao final, em parcelas de igual valor, nos moldes do decidido por este Juízo no Processo nº 0800070-46.2025.8.18.0061;</w:t>
+        <w:t xml:space="preserve">F.	subsidiariamente, a redução dos juros, encargos e demais acréscimos, com dilação do prazo na extensão juridicamente admitida, sempre observado o regime do art. 104-B, § 4º, do CDC;</w:t>
       </w:r>
     </w:p>
     <w:p>

</xml_diff>

<commit_message>
Inicial Francisco: pedido de segredo de justiça para documentos bancários e financeiros (art. 189, III, CPC)
Co-Authored-By: Claude Opus 5.5 <noreply@anthropic.com>
Claude-Session: https://claude.ai/code/session_01EVatDVNz5NJ1N9yNUnzyHx
</commit_message>
<xml_diff>
--- a/Francisco Bernardo Sousa Santos - Superendividamento/Inicial - Repactuação de dívidas - Francisco Bernardo Sousa Santos.docx
+++ b/Francisco Bernardo Sousa Santos - Superendividamento/Inicial - Repactuação de dívidas - Francisco Bernardo Sousa Santos.docx
@@ -321,6 +321,60 @@
     <w:p>
       <w:pPr>
         <w:keepNext/>
+        <w:tabs>
+          <w:tab w:val="left" w:pos="700"/>
+        </w:tabs>
+        <w:spacing w:after="160" w:before="240" w:line="360"/>
+        <w:ind w:left="700" w:hanging="400"/>
+      </w:pPr>
+      <w:r>
+        <w:rPr>
+          <w:rFonts w:ascii="Lora" w:cs="Lora" w:eastAsia="Lora" w:hAnsi="Lora"/>
+          <w:b/>
+          <w:bCs/>
+          <w:i/>
+          <w:iCs/>
+        </w:rPr>
+        <w:t xml:space="preserve">d.	Do sigilo dos documentos bancários e financeiros:</w:t>
+      </w:r>
+    </w:p>
+    <w:p>
+      <w:pPr>
+        <w:spacing w:after="60" w:line="360"/>
+        <w:ind w:firstLine="850"/>
+        <w:jc w:val="both"/>
+      </w:pPr>
+      <w:r>
+        <w:rPr/>
+        <w:t xml:space="preserve">A instrução da demanda exige a juntada de extratos bancários, contracheques, telas de contratos e comprovantes de despesas que revelam a movimentação financeira, a renda e dados pessoais do Autor e de sua família, protegidos pelo sigilo bancário (art. 1º da Lei Complementar nº 105/2001) e pelo direito à intimidade e à vida privada (art. 5º, incisos X e XII, da Constituição Federal).</w:t>
+      </w:r>
+    </w:p>
+    <w:p>
+      <w:pPr>
+        <w:spacing w:after="60" w:line="360"/>
+        <w:ind w:firstLine="850"/>
+        <w:jc w:val="both"/>
+      </w:pPr>
+      <w:r>
+        <w:rPr/>
+        <w:t xml:space="preserve">Requer, assim, com fundamento no art. 189, inciso III, do Código de Processo Civil, que tais documentos tramitem sob </w:t>
+      </w:r>
+      <w:r>
+        <w:rPr>
+          <w:rFonts w:ascii="Lora" w:cs="Lora" w:eastAsia="Lora" w:hAnsi="Lora"/>
+          <w:b/>
+          <w:bCs/>
+        </w:rPr>
+        <w:t xml:space="preserve">segredo de justiça</w:t>
+      </w:r>
+      <w:r>
+        <w:rPr/>
+        <w:t xml:space="preserve">, com acesso restrito às partes e a seus procuradores.</w:t>
+      </w:r>
+    </w:p>
+    <w:p>
+      <w:pPr>
+        <w:keepNext/>
         <w:shd w:fill="123BB8" w:color="auto" w:val="clear"/>
         <w:tabs>
           <w:tab w:val="left" w:pos="1000"/>
@@ -2306,7 +2360,33 @@
       </w:pPr>
       <w:r>
         <w:rPr/>
-        <w:t xml:space="preserve">B.	a concessão de </w:t>
+        <w:t xml:space="preserve">B.	a decretação de </w:t>
+      </w:r>
+      <w:r>
+        <w:rPr>
+          <w:rFonts w:ascii="Lora" w:cs="Lora" w:eastAsia="Lora" w:hAnsi="Lora"/>
+          <w:b/>
+          <w:bCs/>
+        </w:rPr>
+        <w:t xml:space="preserve">segredo de justiça</w:t>
+      </w:r>
+      <w:r>
+        <w:rPr/>
+        <w:t xml:space="preserve"> quanto aos documentos que instruem a inicial com dados bancários e financeiros do Autor (extratos bancários, contracheques, telas de contratos e comprovantes de despesas), nos termos do art. 189, III, do CPC;</w:t>
+      </w:r>
+    </w:p>
+    <w:p>
+      <w:pPr>
+        <w:tabs>
+          <w:tab w:val="left" w:pos="1000"/>
+        </w:tabs>
+        <w:spacing w:after="60" w:line="360"/>
+        <w:ind w:left="1000" w:hanging="400"/>
+        <w:jc w:val="both"/>
+      </w:pPr>
+      <w:r>
+        <w:rPr/>
+        <w:t xml:space="preserve">C.	a concessão de </w:t>
       </w:r>
       <w:r>
         <w:rPr>
@@ -2344,7 +2424,7 @@
       </w:pPr>
       <w:r>
         <w:rPr/>
-        <w:t xml:space="preserve">C.	a designação de </w:t>
+        <w:t xml:space="preserve">D.	a designação de </w:t>
       </w:r>
       <w:r>
         <w:rPr>
@@ -2370,7 +2450,7 @@
       </w:pPr>
       <w:r>
         <w:rPr/>
-        <w:t xml:space="preserve">D.	a </w:t>
+        <w:t xml:space="preserve">E.	a </w:t>
       </w:r>
       <w:r>
         <w:rPr>
@@ -2396,7 +2476,7 @@
       </w:pPr>
       <w:r>
         <w:rPr/>
-        <w:t xml:space="preserve">E.	a </w:t>
+        <w:t xml:space="preserve">F.	a </w:t>
       </w:r>
       <w:r>
         <w:rPr>
@@ -2434,7 +2514,7 @@
       </w:pPr>
       <w:r>
         <w:rPr/>
-        <w:t xml:space="preserve">F.	subsidiariamente, a redução dos juros, encargos e demais acréscimos, com dilação do prazo na extensão juridicamente admitida, sempre observado o regime do art. 104-B, § 4º, do CDC;</w:t>
+        <w:t xml:space="preserve">G.	subsidiariamente, a redução dos juros, encargos e demais acréscimos, com dilação do prazo na extensão juridicamente admitida, sempre observado o regime do art. 104-B, § 4º, do CDC;</w:t>
       </w:r>
     </w:p>
     <w:p>
@@ -2448,7 +2528,7 @@
       </w:pPr>
       <w:r>
         <w:rPr/>
-        <w:t xml:space="preserve">G.	a condenação dos Réus ao pagamento das custas processuais e dos honorários advocatícios de 20% sobre o valor atualizado da causa (art. 85, § 2º, do CPC).</w:t>
+        <w:t xml:space="preserve">H.	a condenação dos Réus ao pagamento das custas processuais e dos honorários advocatícios de 20% sobre o valor atualizado da causa (art. 85, § 2º, do CPC).</w:t>
       </w:r>
     </w:p>
     <w:p>

</xml_diff>